<commit_message>
Ya se hicieron los test de Junit y se documento
</commit_message>
<xml_diff>
--- a/Semana3/04-Unit-Testing/04-Unit-Testing.docx
+++ b/Semana3/04-Unit-Testing/04-Unit-Testing.docx
@@ -399,7 +399,7 @@
           <w:szCs w:val="32"/>
         </w:rPr>
         <w:lastRenderedPageBreak/>
-        <w:t>Concepto 3</w:t>
+        <w:t>Concepto 4</w:t>
       </w:r>
       <w:r>
         <w:rPr>
@@ -409,8 +409,9 @@
           <w:sz w:val="32"/>
           <w:szCs w:val="32"/>
         </w:rPr>
-        <w:t>.1</w:t>
-      </w:r>
+        <w:t xml:space="preserve">.1: </w:t>
+      </w:r>
+      <w:proofErr w:type="spellStart"/>
       <w:r>
         <w:rPr>
           <w:rFonts w:ascii="Arial" w:hAnsi="Arial" w:cs="Arial"/>
@@ -419,9 +420,9 @@
           <w:sz w:val="32"/>
           <w:szCs w:val="32"/>
         </w:rPr>
-        <w:t xml:space="preserve">: Spring </w:t>
-      </w:r>
-      <w:proofErr w:type="spellStart"/>
+        <w:t>Unit</w:t>
+      </w:r>
+      <w:proofErr w:type="spellEnd"/>
       <w:r>
         <w:rPr>
           <w:rFonts w:ascii="Arial" w:hAnsi="Arial" w:cs="Arial"/>
@@ -430,9 +431,9 @@
           <w:sz w:val="32"/>
           <w:szCs w:val="32"/>
         </w:rPr>
-        <w:t>WebFlux</w:t>
-      </w:r>
-      <w:proofErr w:type="spellEnd"/>
+        <w:t xml:space="preserve"> </w:t>
+      </w:r>
+      <w:proofErr w:type="spellStart"/>
       <w:r>
         <w:rPr>
           <w:rFonts w:ascii="Arial" w:hAnsi="Arial" w:cs="Arial"/>
@@ -441,8 +442,2745 @@
           <w:sz w:val="32"/>
           <w:szCs w:val="32"/>
         </w:rPr>
-        <w:t xml:space="preserve"> Mono</w:t>
-      </w:r>
+        <w:t>Testing</w:t>
+      </w:r>
+      <w:proofErr w:type="spellEnd"/>
+      <w:r>
+        <w:rPr>
+          <w:rFonts w:ascii="Arial" w:hAnsi="Arial" w:cs="Arial"/>
+          <w:b/>
+          <w:bCs/>
+          <w:sz w:val="32"/>
+          <w:szCs w:val="32"/>
+        </w:rPr>
+        <w:t xml:space="preserve"> con J</w:t>
+      </w:r>
+      <w:r>
+        <w:rPr>
+          <w:rFonts w:ascii="Arial" w:hAnsi="Arial" w:cs="Arial"/>
+          <w:b/>
+          <w:bCs/>
+          <w:sz w:val="32"/>
+          <w:szCs w:val="32"/>
+        </w:rPr>
+        <w:t>u</w:t>
+      </w:r>
+      <w:r>
+        <w:rPr>
+          <w:rFonts w:ascii="Arial" w:hAnsi="Arial" w:cs="Arial"/>
+          <w:b/>
+          <w:bCs/>
+          <w:sz w:val="32"/>
+          <w:szCs w:val="32"/>
+        </w:rPr>
+        <w:t>nit</w:t>
+      </w:r>
+    </w:p>
+    <w:p>
+      <w:pPr>
+        <w:spacing w:line="360" w:lineRule="auto"/>
+        <w:jc w:val="both"/>
+        <w:rPr>
+          <w:rFonts w:ascii="Arial" w:hAnsi="Arial" w:cs="Arial"/>
+          <w:sz w:val="28"/>
+          <w:szCs w:val="28"/>
+        </w:rPr>
+      </w:pPr>
+      <w:proofErr w:type="gramStart"/>
+      <w:r>
+        <w:rPr>
+          <w:rFonts w:ascii="Arial" w:hAnsi="Arial" w:cs="Arial"/>
+          <w:sz w:val="28"/>
+          <w:szCs w:val="28"/>
+        </w:rPr>
+        <w:t>Un test</w:t>
+      </w:r>
+      <w:proofErr w:type="gramEnd"/>
+      <w:r>
+        <w:rPr>
+          <w:rFonts w:ascii="Arial" w:hAnsi="Arial" w:cs="Arial"/>
+          <w:sz w:val="28"/>
+          <w:szCs w:val="28"/>
+        </w:rPr>
+        <w:t xml:space="preserve"> automatizado es una </w:t>
+      </w:r>
+      <w:proofErr w:type="spellStart"/>
+      <w:r>
+        <w:rPr>
+          <w:rFonts w:ascii="Arial" w:hAnsi="Arial" w:cs="Arial"/>
+          <w:sz w:val="28"/>
+          <w:szCs w:val="28"/>
+        </w:rPr>
+        <w:t>afirmacion</w:t>
+      </w:r>
+      <w:proofErr w:type="spellEnd"/>
+      <w:r>
+        <w:rPr>
+          <w:rFonts w:ascii="Arial" w:hAnsi="Arial" w:cs="Arial"/>
+          <w:sz w:val="28"/>
+          <w:szCs w:val="28"/>
+        </w:rPr>
+        <w:t xml:space="preserve"> sobre el </w:t>
+      </w:r>
+      <w:proofErr w:type="spellStart"/>
+      <w:r>
+        <w:rPr>
+          <w:rFonts w:ascii="Arial" w:hAnsi="Arial" w:cs="Arial"/>
+          <w:sz w:val="28"/>
+          <w:szCs w:val="28"/>
+        </w:rPr>
+        <w:t>codigo</w:t>
+      </w:r>
+      <w:proofErr w:type="spellEnd"/>
+      <w:r>
+        <w:rPr>
+          <w:rFonts w:ascii="Arial" w:hAnsi="Arial" w:cs="Arial"/>
+          <w:sz w:val="28"/>
+          <w:szCs w:val="28"/>
+        </w:rPr>
+        <w:t xml:space="preserve"> que una maquina puede comprobar por si sola sin </w:t>
+      </w:r>
+      <w:proofErr w:type="spellStart"/>
+      <w:r>
+        <w:rPr>
+          <w:rFonts w:ascii="Arial" w:hAnsi="Arial" w:cs="Arial"/>
+          <w:sz w:val="28"/>
+          <w:szCs w:val="28"/>
+        </w:rPr>
+        <w:t>intervencion</w:t>
+      </w:r>
+      <w:proofErr w:type="spellEnd"/>
+      <w:r>
+        <w:rPr>
+          <w:rFonts w:ascii="Arial" w:hAnsi="Arial" w:cs="Arial"/>
+          <w:sz w:val="28"/>
+          <w:szCs w:val="28"/>
+        </w:rPr>
+        <w:t xml:space="preserve"> humana. El </w:t>
+      </w:r>
+      <w:proofErr w:type="spellStart"/>
+      <w:r>
+        <w:rPr>
+          <w:rFonts w:ascii="Arial" w:hAnsi="Arial" w:cs="Arial"/>
+          <w:sz w:val="28"/>
+          <w:szCs w:val="28"/>
+        </w:rPr>
+        <w:t>testing</w:t>
+      </w:r>
+      <w:proofErr w:type="spellEnd"/>
+      <w:r>
+        <w:rPr>
+          <w:rFonts w:ascii="Arial" w:hAnsi="Arial" w:cs="Arial"/>
+          <w:sz w:val="28"/>
+          <w:szCs w:val="28"/>
+        </w:rPr>
+        <w:t xml:space="preserve"> unitario resuelve el miedo a modificar el sistema, </w:t>
+      </w:r>
+      <w:proofErr w:type="gramStart"/>
+      <w:r>
+        <w:rPr>
+          <w:rFonts w:ascii="Arial" w:hAnsi="Arial" w:cs="Arial"/>
+          <w:sz w:val="28"/>
+          <w:szCs w:val="28"/>
+        </w:rPr>
+        <w:t>ya que</w:t>
+      </w:r>
+      <w:proofErr w:type="gramEnd"/>
+      <w:r>
+        <w:rPr>
+          <w:rFonts w:ascii="Arial" w:hAnsi="Arial" w:cs="Arial"/>
+          <w:sz w:val="28"/>
+          <w:szCs w:val="28"/>
+        </w:rPr>
+        <w:t xml:space="preserve"> si algo se rompe por accidente, la prueba avisa de inmediato detallando la clase y la </w:t>
+      </w:r>
+      <w:proofErr w:type="spellStart"/>
+      <w:r>
+        <w:rPr>
+          <w:rFonts w:ascii="Arial" w:hAnsi="Arial" w:cs="Arial"/>
+          <w:sz w:val="28"/>
+          <w:szCs w:val="28"/>
+        </w:rPr>
+        <w:t>linea</w:t>
+      </w:r>
+      <w:proofErr w:type="spellEnd"/>
+      <w:r>
+        <w:rPr>
+          <w:rFonts w:ascii="Arial" w:hAnsi="Arial" w:cs="Arial"/>
+          <w:sz w:val="28"/>
+          <w:szCs w:val="28"/>
+        </w:rPr>
+        <w:t xml:space="preserve"> exacta del fallo. Sobre la </w:t>
+      </w:r>
+      <w:proofErr w:type="spellStart"/>
+      <w:r>
+        <w:rPr>
+          <w:rFonts w:ascii="Arial" w:hAnsi="Arial" w:cs="Arial"/>
+          <w:sz w:val="28"/>
+          <w:szCs w:val="28"/>
+        </w:rPr>
+        <w:t>version</w:t>
+      </w:r>
+      <w:proofErr w:type="spellEnd"/>
+      <w:r>
+        <w:rPr>
+          <w:rFonts w:ascii="Arial" w:hAnsi="Arial" w:cs="Arial"/>
+          <w:sz w:val="28"/>
+          <w:szCs w:val="28"/>
+        </w:rPr>
+        <w:t xml:space="preserve"> de la herramienta, el temario de la materia menciona </w:t>
+      </w:r>
+      <w:proofErr w:type="spellStart"/>
+      <w:r>
+        <w:rPr>
+          <w:rFonts w:ascii="Arial" w:hAnsi="Arial" w:cs="Arial"/>
+          <w:sz w:val="28"/>
+          <w:szCs w:val="28"/>
+        </w:rPr>
+        <w:t>JUnit</w:t>
+      </w:r>
+      <w:proofErr w:type="spellEnd"/>
+      <w:r>
+        <w:rPr>
+          <w:rFonts w:ascii="Arial" w:hAnsi="Arial" w:cs="Arial"/>
+          <w:sz w:val="28"/>
+          <w:szCs w:val="28"/>
+        </w:rPr>
+        <w:t xml:space="preserve"> 5 pero el </w:t>
+      </w:r>
+      <w:proofErr w:type="spellStart"/>
+      <w:r>
+        <w:rPr>
+          <w:rFonts w:ascii="Arial" w:hAnsi="Arial" w:cs="Arial"/>
+          <w:sz w:val="28"/>
+          <w:szCs w:val="28"/>
+        </w:rPr>
+        <w:t>codigo</w:t>
+      </w:r>
+      <w:proofErr w:type="spellEnd"/>
+      <w:r>
+        <w:rPr>
+          <w:rFonts w:ascii="Arial" w:hAnsi="Arial" w:cs="Arial"/>
+          <w:sz w:val="28"/>
+          <w:szCs w:val="28"/>
+        </w:rPr>
+        <w:t xml:space="preserve"> entregado usa </w:t>
+      </w:r>
+      <w:proofErr w:type="spellStart"/>
+      <w:r>
+        <w:rPr>
+          <w:rFonts w:ascii="Arial" w:hAnsi="Arial" w:cs="Arial"/>
+          <w:sz w:val="28"/>
+          <w:szCs w:val="28"/>
+        </w:rPr>
+        <w:t>JUnit</w:t>
+      </w:r>
+      <w:proofErr w:type="spellEnd"/>
+      <w:r>
+        <w:rPr>
+          <w:rFonts w:ascii="Arial" w:hAnsi="Arial" w:cs="Arial"/>
+          <w:sz w:val="28"/>
+          <w:szCs w:val="28"/>
+        </w:rPr>
+        <w:t xml:space="preserve"> 6.1.3. Esto es completamente valido porque los paquetes y anotaciones que se escriben siguen siendo los mismos, solo que ahora el motor interno exige Java 17 como </w:t>
+      </w:r>
+      <w:proofErr w:type="spellStart"/>
+      <w:r>
+        <w:rPr>
+          <w:rFonts w:ascii="Arial" w:hAnsi="Arial" w:cs="Arial"/>
+          <w:sz w:val="28"/>
+          <w:szCs w:val="28"/>
+        </w:rPr>
+        <w:t>minimo</w:t>
+      </w:r>
+      <w:proofErr w:type="spellEnd"/>
+      <w:r>
+        <w:rPr>
+          <w:rFonts w:ascii="Arial" w:hAnsi="Arial" w:cs="Arial"/>
+          <w:sz w:val="28"/>
+          <w:szCs w:val="28"/>
+        </w:rPr>
+        <w:t>.</w:t>
+      </w:r>
+      <w:r>
+        <w:rPr>
+          <w:rFonts w:ascii="Arial" w:hAnsi="Arial" w:cs="Arial"/>
+          <w:sz w:val="28"/>
+          <w:szCs w:val="28"/>
+        </w:rPr>
+        <w:t xml:space="preserve"> </w:t>
+      </w:r>
+      <w:r>
+        <w:rPr>
+          <w:rFonts w:ascii="Arial" w:hAnsi="Arial" w:cs="Arial"/>
+          <w:sz w:val="28"/>
+          <w:szCs w:val="28"/>
+        </w:rPr>
+        <w:t xml:space="preserve">Un </w:t>
+      </w:r>
+      <w:proofErr w:type="spellStart"/>
+      <w:r>
+        <w:rPr>
+          <w:rFonts w:ascii="Arial" w:hAnsi="Arial" w:cs="Arial"/>
+          <w:sz w:val="28"/>
+          <w:szCs w:val="28"/>
+        </w:rPr>
+        <w:t>record</w:t>
+      </w:r>
+      <w:proofErr w:type="spellEnd"/>
+      <w:r>
+        <w:rPr>
+          <w:rFonts w:ascii="Arial" w:hAnsi="Arial" w:cs="Arial"/>
+          <w:sz w:val="28"/>
+          <w:szCs w:val="28"/>
+        </w:rPr>
+        <w:t xml:space="preserve"> o un </w:t>
+      </w:r>
+      <w:proofErr w:type="spellStart"/>
+      <w:r>
+        <w:rPr>
+          <w:rFonts w:ascii="Arial" w:hAnsi="Arial" w:cs="Arial"/>
+          <w:sz w:val="28"/>
+          <w:szCs w:val="28"/>
+        </w:rPr>
+        <w:t>getter</w:t>
+      </w:r>
+      <w:proofErr w:type="spellEnd"/>
+      <w:r>
+        <w:rPr>
+          <w:rFonts w:ascii="Arial" w:hAnsi="Arial" w:cs="Arial"/>
+          <w:sz w:val="28"/>
+          <w:szCs w:val="28"/>
+        </w:rPr>
+        <w:t xml:space="preserve"> que solo guarda datos no necesita pruebas porque no decide nada. Se le hacen pruebas exclusivas al </w:t>
+      </w:r>
+      <w:proofErr w:type="spellStart"/>
+      <w:r>
+        <w:rPr>
+          <w:rFonts w:ascii="Arial" w:hAnsi="Arial" w:cs="Arial"/>
+          <w:sz w:val="28"/>
+          <w:szCs w:val="28"/>
+        </w:rPr>
+        <w:t>codigo</w:t>
+      </w:r>
+      <w:proofErr w:type="spellEnd"/>
+      <w:r>
+        <w:rPr>
+          <w:rFonts w:ascii="Arial" w:hAnsi="Arial" w:cs="Arial"/>
+          <w:sz w:val="28"/>
+          <w:szCs w:val="28"/>
+        </w:rPr>
+        <w:t xml:space="preserve"> que toma decisiones, al que calcula, al que rechaza y al que valida</w:t>
+      </w:r>
+      <w:r>
+        <w:rPr>
+          <w:rFonts w:ascii="Arial" w:hAnsi="Arial" w:cs="Arial"/>
+          <w:sz w:val="28"/>
+          <w:szCs w:val="28"/>
+        </w:rPr>
+        <w:t>. Siempre hay que</w:t>
+      </w:r>
+      <w:r>
+        <w:rPr>
+          <w:rFonts w:ascii="Arial" w:hAnsi="Arial" w:cs="Arial"/>
+          <w:sz w:val="28"/>
+          <w:szCs w:val="28"/>
+        </w:rPr>
+        <w:t xml:space="preserve"> probar los </w:t>
+      </w:r>
+      <w:proofErr w:type="spellStart"/>
+      <w:r>
+        <w:rPr>
+          <w:rFonts w:ascii="Arial" w:hAnsi="Arial" w:cs="Arial"/>
+          <w:sz w:val="28"/>
+          <w:szCs w:val="28"/>
+        </w:rPr>
+        <w:t>limites</w:t>
+      </w:r>
+      <w:proofErr w:type="spellEnd"/>
+      <w:r>
+        <w:rPr>
+          <w:rFonts w:ascii="Arial" w:hAnsi="Arial" w:cs="Arial"/>
+          <w:sz w:val="28"/>
+          <w:szCs w:val="28"/>
+        </w:rPr>
+        <w:t xml:space="preserve">, el </w:t>
+      </w:r>
+      <w:proofErr w:type="spellStart"/>
+      <w:r>
+        <w:rPr>
+          <w:rFonts w:ascii="Arial" w:hAnsi="Arial" w:cs="Arial"/>
+          <w:sz w:val="28"/>
+          <w:szCs w:val="28"/>
+        </w:rPr>
+        <w:t>limite</w:t>
+      </w:r>
+      <w:proofErr w:type="spellEnd"/>
+      <w:r>
+        <w:rPr>
+          <w:rFonts w:ascii="Arial" w:hAnsi="Arial" w:cs="Arial"/>
+          <w:sz w:val="28"/>
+          <w:szCs w:val="28"/>
+        </w:rPr>
+        <w:t xml:space="preserve"> menos uno, el </w:t>
+      </w:r>
+      <w:proofErr w:type="spellStart"/>
+      <w:r>
+        <w:rPr>
+          <w:rFonts w:ascii="Arial" w:hAnsi="Arial" w:cs="Arial"/>
+          <w:sz w:val="28"/>
+          <w:szCs w:val="28"/>
+        </w:rPr>
+        <w:t>limite</w:t>
+      </w:r>
+      <w:proofErr w:type="spellEnd"/>
+      <w:r>
+        <w:rPr>
+          <w:rFonts w:ascii="Arial" w:hAnsi="Arial" w:cs="Arial"/>
+          <w:sz w:val="28"/>
+          <w:szCs w:val="28"/>
+        </w:rPr>
+        <w:t xml:space="preserve"> </w:t>
+      </w:r>
+      <w:proofErr w:type="spellStart"/>
+      <w:r>
+        <w:rPr>
+          <w:rFonts w:ascii="Arial" w:hAnsi="Arial" w:cs="Arial"/>
+          <w:sz w:val="28"/>
+          <w:szCs w:val="28"/>
+        </w:rPr>
+        <w:t>mas</w:t>
+      </w:r>
+      <w:proofErr w:type="spellEnd"/>
+      <w:r>
+        <w:rPr>
+          <w:rFonts w:ascii="Arial" w:hAnsi="Arial" w:cs="Arial"/>
+          <w:sz w:val="28"/>
+          <w:szCs w:val="28"/>
+        </w:rPr>
+        <w:t xml:space="preserve"> uno, el </w:t>
+      </w:r>
+      <w:proofErr w:type="spellStart"/>
+      <w:r>
+        <w:rPr>
+          <w:rFonts w:ascii="Arial" w:hAnsi="Arial" w:cs="Arial"/>
+          <w:sz w:val="28"/>
+          <w:szCs w:val="28"/>
+        </w:rPr>
+        <w:t>vacio</w:t>
+      </w:r>
+      <w:proofErr w:type="spellEnd"/>
+      <w:r>
+        <w:rPr>
+          <w:rFonts w:ascii="Arial" w:hAnsi="Arial" w:cs="Arial"/>
+          <w:sz w:val="28"/>
+          <w:szCs w:val="28"/>
+        </w:rPr>
+        <w:t xml:space="preserve"> y el nulo. </w:t>
+      </w:r>
+      <w:r>
+        <w:rPr>
+          <w:rFonts w:ascii="Arial" w:hAnsi="Arial" w:cs="Arial"/>
+          <w:sz w:val="28"/>
+          <w:szCs w:val="28"/>
+        </w:rPr>
+        <w:t>Todo en lo que el código pudiera corromperse</w:t>
+      </w:r>
+      <w:r>
+        <w:rPr>
+          <w:rFonts w:ascii="Arial" w:hAnsi="Arial" w:cs="Arial"/>
+          <w:sz w:val="28"/>
+          <w:szCs w:val="28"/>
+        </w:rPr>
+        <w:t>.</w:t>
+      </w:r>
+    </w:p>
+    <w:p>
+      <w:pPr>
+        <w:spacing w:line="360" w:lineRule="auto"/>
+        <w:jc w:val="both"/>
+        <w:rPr>
+          <w:rFonts w:ascii="Arial" w:hAnsi="Arial" w:cs="Arial"/>
+          <w:sz w:val="28"/>
+          <w:szCs w:val="28"/>
+        </w:rPr>
+      </w:pPr>
+      <w:r>
+        <w:rPr>
+          <w:rFonts w:ascii="Arial" w:hAnsi="Arial" w:cs="Arial"/>
+          <w:sz w:val="28"/>
+          <w:szCs w:val="28"/>
+        </w:rPr>
+        <w:t>Los proyectos como b</w:t>
+      </w:r>
+      <w:r>
+        <w:rPr>
+          <w:rFonts w:ascii="Arial" w:hAnsi="Arial" w:cs="Arial"/>
+          <w:sz w:val="28"/>
+          <w:szCs w:val="28"/>
+        </w:rPr>
+        <w:t xml:space="preserve">ase </w:t>
+      </w:r>
+      <w:r>
+        <w:rPr>
+          <w:rFonts w:ascii="Arial" w:hAnsi="Arial" w:cs="Arial"/>
+          <w:sz w:val="28"/>
+          <w:szCs w:val="28"/>
+        </w:rPr>
+        <w:t xml:space="preserve">son </w:t>
+      </w:r>
+      <w:proofErr w:type="spellStart"/>
+      <w:r>
+        <w:rPr>
+          <w:rFonts w:ascii="Arial" w:hAnsi="Arial" w:cs="Arial"/>
+          <w:sz w:val="28"/>
+          <w:szCs w:val="28"/>
+        </w:rPr>
+        <w:t>academiaMonterrey</w:t>
+      </w:r>
+      <w:proofErr w:type="spellEnd"/>
+      <w:r>
+        <w:rPr>
+          <w:rFonts w:ascii="Arial" w:hAnsi="Arial" w:cs="Arial"/>
+          <w:sz w:val="28"/>
+          <w:szCs w:val="28"/>
+        </w:rPr>
+        <w:t xml:space="preserve">/Semana3/04-Unit-Testing en donde se encuentran los proyectos </w:t>
+      </w:r>
+      <w:r>
+        <w:rPr>
+          <w:rFonts w:ascii="Arial" w:hAnsi="Arial" w:cs="Arial"/>
+          <w:sz w:val="28"/>
+          <w:szCs w:val="28"/>
+        </w:rPr>
+        <w:t>01-junit-fundamentos, 02-junit-catalogo y 03-junit-datos</w:t>
+      </w:r>
+      <w:r>
+        <w:rPr>
+          <w:rFonts w:ascii="Arial" w:hAnsi="Arial" w:cs="Arial"/>
+          <w:sz w:val="28"/>
+          <w:szCs w:val="28"/>
+        </w:rPr>
+        <w:t xml:space="preserve">. </w:t>
+      </w:r>
+      <w:r>
+        <w:rPr>
+          <w:rFonts w:ascii="Arial" w:hAnsi="Arial" w:cs="Arial"/>
+          <w:sz w:val="28"/>
+          <w:szCs w:val="28"/>
+        </w:rPr>
+        <w:t xml:space="preserve">En estos tres primeros proyectos se </w:t>
+      </w:r>
+      <w:proofErr w:type="spellStart"/>
+      <w:r>
+        <w:rPr>
+          <w:rFonts w:ascii="Arial" w:hAnsi="Arial" w:cs="Arial"/>
+          <w:sz w:val="28"/>
+          <w:szCs w:val="28"/>
+        </w:rPr>
+        <w:t>aplico</w:t>
+      </w:r>
+      <w:proofErr w:type="spellEnd"/>
+      <w:r>
+        <w:rPr>
+          <w:rFonts w:ascii="Arial" w:hAnsi="Arial" w:cs="Arial"/>
+          <w:sz w:val="28"/>
+          <w:szCs w:val="28"/>
+        </w:rPr>
+        <w:t xml:space="preserve"> </w:t>
+      </w:r>
+      <w:proofErr w:type="spellStart"/>
+      <w:r>
+        <w:rPr>
+          <w:rFonts w:ascii="Arial" w:hAnsi="Arial" w:cs="Arial"/>
+          <w:sz w:val="28"/>
+          <w:szCs w:val="28"/>
+        </w:rPr>
+        <w:t>JUnit</w:t>
+      </w:r>
+      <w:proofErr w:type="spellEnd"/>
+      <w:r>
+        <w:rPr>
+          <w:rFonts w:ascii="Arial" w:hAnsi="Arial" w:cs="Arial"/>
+          <w:sz w:val="28"/>
+          <w:szCs w:val="28"/>
+        </w:rPr>
+        <w:t xml:space="preserve"> de forma progresiva</w:t>
+      </w:r>
+      <w:r>
+        <w:rPr>
+          <w:rFonts w:ascii="Arial" w:hAnsi="Arial" w:cs="Arial"/>
+          <w:sz w:val="28"/>
+          <w:szCs w:val="28"/>
+        </w:rPr>
+        <w:t>.</w:t>
+      </w:r>
+    </w:p>
+    <w:p>
+      <w:pPr>
+        <w:pStyle w:val="Prrafodelista"/>
+        <w:numPr>
+          <w:ilvl w:val="0"/>
+          <w:numId w:val="19"/>
+        </w:numPr>
+        <w:spacing w:line="360" w:lineRule="auto"/>
+        <w:jc w:val="both"/>
+        <w:rPr>
+          <w:rFonts w:ascii="Arial" w:hAnsi="Arial" w:cs="Arial"/>
+          <w:sz w:val="28"/>
+          <w:szCs w:val="28"/>
+        </w:rPr>
+      </w:pPr>
+      <w:r>
+        <w:rPr>
+          <w:rFonts w:ascii="Arial" w:hAnsi="Arial" w:cs="Arial"/>
+          <w:sz w:val="28"/>
+          <w:szCs w:val="28"/>
+        </w:rPr>
+        <w:t xml:space="preserve">Fundamentos y ciclo de vida: En el proyecto 01, la clase </w:t>
+      </w:r>
+      <w:proofErr w:type="spellStart"/>
+      <w:r>
+        <w:rPr>
+          <w:rFonts w:ascii="Arial" w:hAnsi="Arial" w:cs="Arial"/>
+          <w:sz w:val="28"/>
+          <w:szCs w:val="28"/>
+        </w:rPr>
+        <w:t>CicloDeVidaTest</w:t>
+      </w:r>
+      <w:proofErr w:type="spellEnd"/>
+      <w:r>
+        <w:rPr>
+          <w:rFonts w:ascii="Arial" w:hAnsi="Arial" w:cs="Arial"/>
+          <w:sz w:val="28"/>
+          <w:szCs w:val="28"/>
+        </w:rPr>
+        <w:t xml:space="preserve"> java demuestra el uso de la </w:t>
+      </w:r>
+      <w:proofErr w:type="spellStart"/>
+      <w:r>
+        <w:rPr>
+          <w:rFonts w:ascii="Arial" w:hAnsi="Arial" w:cs="Arial"/>
+          <w:sz w:val="28"/>
+          <w:szCs w:val="28"/>
+        </w:rPr>
+        <w:t>anotacion</w:t>
+      </w:r>
+      <w:proofErr w:type="spellEnd"/>
+      <w:r>
+        <w:rPr>
+          <w:rFonts w:ascii="Arial" w:hAnsi="Arial" w:cs="Arial"/>
+          <w:sz w:val="28"/>
+          <w:szCs w:val="28"/>
+        </w:rPr>
+        <w:t xml:space="preserve"> </w:t>
+      </w:r>
+      <w:proofErr w:type="spellStart"/>
+      <w:r>
+        <w:rPr>
+          <w:rFonts w:ascii="Arial" w:hAnsi="Arial" w:cs="Arial"/>
+          <w:sz w:val="28"/>
+          <w:szCs w:val="28"/>
+        </w:rPr>
+        <w:t>BeforeEach</w:t>
+      </w:r>
+      <w:proofErr w:type="spellEnd"/>
+      <w:r>
+        <w:rPr>
+          <w:rFonts w:ascii="Arial" w:hAnsi="Arial" w:cs="Arial"/>
+          <w:sz w:val="28"/>
+          <w:szCs w:val="28"/>
+        </w:rPr>
+        <w:t xml:space="preserve"> para instanciar un escenario limpio antes de cada prueba individual. </w:t>
+      </w:r>
+      <w:proofErr w:type="spellStart"/>
+      <w:r>
+        <w:rPr>
+          <w:rFonts w:ascii="Arial" w:hAnsi="Arial" w:cs="Arial"/>
+          <w:sz w:val="28"/>
+          <w:szCs w:val="28"/>
+        </w:rPr>
+        <w:t>Ademas</w:t>
+      </w:r>
+      <w:proofErr w:type="spellEnd"/>
+      <w:r>
+        <w:rPr>
+          <w:rFonts w:ascii="Arial" w:hAnsi="Arial" w:cs="Arial"/>
+          <w:sz w:val="28"/>
+          <w:szCs w:val="28"/>
+        </w:rPr>
+        <w:t xml:space="preserve">, </w:t>
+      </w:r>
+      <w:proofErr w:type="spellStart"/>
+      <w:r>
+        <w:rPr>
+          <w:rFonts w:ascii="Arial" w:hAnsi="Arial" w:cs="Arial"/>
+          <w:sz w:val="28"/>
+          <w:szCs w:val="28"/>
+        </w:rPr>
+        <w:t>AsercionesTest</w:t>
+      </w:r>
+      <w:proofErr w:type="spellEnd"/>
+      <w:r>
+        <w:rPr>
+          <w:rFonts w:ascii="Arial" w:hAnsi="Arial" w:cs="Arial"/>
+          <w:sz w:val="28"/>
+          <w:szCs w:val="28"/>
+        </w:rPr>
+        <w:t xml:space="preserve"> java agrupa </w:t>
+      </w:r>
+      <w:proofErr w:type="spellStart"/>
+      <w:r>
+        <w:rPr>
+          <w:rFonts w:ascii="Arial" w:hAnsi="Arial" w:cs="Arial"/>
+          <w:sz w:val="28"/>
+          <w:szCs w:val="28"/>
+        </w:rPr>
+        <w:t>multiples</w:t>
+      </w:r>
+      <w:proofErr w:type="spellEnd"/>
+      <w:r>
+        <w:rPr>
+          <w:rFonts w:ascii="Arial" w:hAnsi="Arial" w:cs="Arial"/>
+          <w:sz w:val="28"/>
+          <w:szCs w:val="28"/>
+        </w:rPr>
+        <w:t xml:space="preserve"> validaciones usando </w:t>
+      </w:r>
+      <w:proofErr w:type="spellStart"/>
+      <w:r>
+        <w:rPr>
+          <w:rFonts w:ascii="Arial" w:hAnsi="Arial" w:cs="Arial"/>
+          <w:sz w:val="28"/>
+          <w:szCs w:val="28"/>
+        </w:rPr>
+        <w:t>assertAll</w:t>
+      </w:r>
+      <w:proofErr w:type="spellEnd"/>
+      <w:r>
+        <w:rPr>
+          <w:rFonts w:ascii="Arial" w:hAnsi="Arial" w:cs="Arial"/>
+          <w:sz w:val="28"/>
+          <w:szCs w:val="28"/>
+        </w:rPr>
+        <w:t xml:space="preserve"> para que </w:t>
+      </w:r>
+      <w:proofErr w:type="gramStart"/>
+      <w:r>
+        <w:rPr>
+          <w:rFonts w:ascii="Arial" w:hAnsi="Arial" w:cs="Arial"/>
+          <w:sz w:val="28"/>
+          <w:szCs w:val="28"/>
+        </w:rPr>
+        <w:t>el test</w:t>
+      </w:r>
+      <w:proofErr w:type="gramEnd"/>
+      <w:r>
+        <w:rPr>
+          <w:rFonts w:ascii="Arial" w:hAnsi="Arial" w:cs="Arial"/>
+          <w:sz w:val="28"/>
+          <w:szCs w:val="28"/>
+        </w:rPr>
+        <w:t xml:space="preserve"> no se detenga en el primer fallo y reporte todo de un golpe. </w:t>
+      </w:r>
+    </w:p>
+    <w:p>
+      <w:pPr>
+        <w:pStyle w:val="Prrafodelista"/>
+        <w:numPr>
+          <w:ilvl w:val="0"/>
+          <w:numId w:val="19"/>
+        </w:numPr>
+        <w:spacing w:line="360" w:lineRule="auto"/>
+        <w:jc w:val="both"/>
+        <w:rPr>
+          <w:rFonts w:ascii="Arial" w:hAnsi="Arial" w:cs="Arial"/>
+          <w:sz w:val="28"/>
+          <w:szCs w:val="28"/>
+        </w:rPr>
+      </w:pPr>
+      <w:r>
+        <w:rPr>
+          <w:rFonts w:ascii="Arial" w:hAnsi="Arial" w:cs="Arial"/>
+          <w:sz w:val="28"/>
+          <w:szCs w:val="28"/>
+        </w:rPr>
+        <w:lastRenderedPageBreak/>
+        <w:t xml:space="preserve">El </w:t>
+      </w:r>
+      <w:proofErr w:type="spellStart"/>
+      <w:r>
+        <w:rPr>
+          <w:rFonts w:ascii="Arial" w:hAnsi="Arial" w:cs="Arial"/>
+          <w:sz w:val="28"/>
+          <w:szCs w:val="28"/>
+        </w:rPr>
+        <w:t>catalogo</w:t>
+      </w:r>
+      <w:proofErr w:type="spellEnd"/>
+      <w:r>
+        <w:rPr>
+          <w:rFonts w:ascii="Arial" w:hAnsi="Arial" w:cs="Arial"/>
+          <w:sz w:val="28"/>
+          <w:szCs w:val="28"/>
+        </w:rPr>
+        <w:t xml:space="preserve"> y los rechazos: En el proyecto 02, la clase </w:t>
+      </w:r>
+      <w:proofErr w:type="spellStart"/>
+      <w:r>
+        <w:rPr>
+          <w:rFonts w:ascii="Arial" w:hAnsi="Arial" w:cs="Arial"/>
+          <w:sz w:val="28"/>
+          <w:szCs w:val="28"/>
+        </w:rPr>
+        <w:t>ExcepcionesTest</w:t>
+      </w:r>
+      <w:proofErr w:type="spellEnd"/>
+      <w:r>
+        <w:rPr>
+          <w:rFonts w:ascii="Arial" w:hAnsi="Arial" w:cs="Arial"/>
+          <w:sz w:val="28"/>
+          <w:szCs w:val="28"/>
+        </w:rPr>
+        <w:t xml:space="preserve"> java usa </w:t>
+      </w:r>
+      <w:proofErr w:type="spellStart"/>
+      <w:r>
+        <w:rPr>
+          <w:rFonts w:ascii="Arial" w:hAnsi="Arial" w:cs="Arial"/>
+          <w:sz w:val="28"/>
+          <w:szCs w:val="28"/>
+        </w:rPr>
+        <w:t>assertThrows</w:t>
+      </w:r>
+      <w:proofErr w:type="spellEnd"/>
+      <w:r>
+        <w:rPr>
+          <w:rFonts w:ascii="Arial" w:hAnsi="Arial" w:cs="Arial"/>
+          <w:sz w:val="28"/>
+          <w:szCs w:val="28"/>
+        </w:rPr>
+        <w:t xml:space="preserve"> para probar el camino de error, garantizando que el sistema lance </w:t>
+      </w:r>
+      <w:proofErr w:type="spellStart"/>
+      <w:r>
+        <w:rPr>
+          <w:rFonts w:ascii="Arial" w:hAnsi="Arial" w:cs="Arial"/>
+          <w:sz w:val="28"/>
+          <w:szCs w:val="28"/>
+        </w:rPr>
+        <w:t>CupoLlenoException</w:t>
+      </w:r>
+      <w:proofErr w:type="spellEnd"/>
+      <w:r>
+        <w:rPr>
+          <w:rFonts w:ascii="Arial" w:hAnsi="Arial" w:cs="Arial"/>
+          <w:sz w:val="28"/>
+          <w:szCs w:val="28"/>
+        </w:rPr>
+        <w:t xml:space="preserve"> al intentar inscribir a un alumno en un curso sin lugares. </w:t>
+      </w:r>
+      <w:proofErr w:type="spellStart"/>
+      <w:r>
+        <w:rPr>
+          <w:rFonts w:ascii="Arial" w:hAnsi="Arial" w:cs="Arial"/>
+          <w:sz w:val="28"/>
+          <w:szCs w:val="28"/>
+        </w:rPr>
+        <w:t>Tambien</w:t>
+      </w:r>
+      <w:proofErr w:type="spellEnd"/>
+      <w:r>
+        <w:rPr>
+          <w:rFonts w:ascii="Arial" w:hAnsi="Arial" w:cs="Arial"/>
+          <w:sz w:val="28"/>
+          <w:szCs w:val="28"/>
+        </w:rPr>
+        <w:t xml:space="preserve"> se agruparon las pruebas por estado usando </w:t>
+      </w:r>
+      <w:proofErr w:type="spellStart"/>
+      <w:r>
+        <w:rPr>
+          <w:rFonts w:ascii="Arial" w:hAnsi="Arial" w:cs="Arial"/>
+          <w:sz w:val="28"/>
+          <w:szCs w:val="28"/>
+        </w:rPr>
+        <w:t>Nested</w:t>
+      </w:r>
+      <w:proofErr w:type="spellEnd"/>
+      <w:r>
+        <w:rPr>
+          <w:rFonts w:ascii="Arial" w:hAnsi="Arial" w:cs="Arial"/>
+          <w:sz w:val="28"/>
+          <w:szCs w:val="28"/>
+        </w:rPr>
+        <w:t xml:space="preserve"> en </w:t>
+      </w:r>
+      <w:proofErr w:type="spellStart"/>
+      <w:r>
+        <w:rPr>
+          <w:rFonts w:ascii="Arial" w:hAnsi="Arial" w:cs="Arial"/>
+          <w:sz w:val="28"/>
+          <w:szCs w:val="28"/>
+        </w:rPr>
+        <w:t>CursoNestedTest</w:t>
+      </w:r>
+      <w:proofErr w:type="spellEnd"/>
+      <w:r>
+        <w:rPr>
+          <w:rFonts w:ascii="Arial" w:hAnsi="Arial" w:cs="Arial"/>
+          <w:sz w:val="28"/>
+          <w:szCs w:val="28"/>
+        </w:rPr>
+        <w:t xml:space="preserve"> java.  </w:t>
+      </w:r>
+    </w:p>
+    <w:p>
+      <w:pPr>
+        <w:pStyle w:val="Prrafodelista"/>
+        <w:numPr>
+          <w:ilvl w:val="0"/>
+          <w:numId w:val="19"/>
+        </w:numPr>
+        <w:spacing w:line="360" w:lineRule="auto"/>
+        <w:jc w:val="both"/>
+        <w:rPr>
+          <w:rFonts w:ascii="Arial" w:hAnsi="Arial" w:cs="Arial"/>
+          <w:sz w:val="28"/>
+          <w:szCs w:val="28"/>
+        </w:rPr>
+      </w:pPr>
+      <w:r>
+        <w:rPr>
+          <w:rFonts w:ascii="Arial" w:hAnsi="Arial" w:cs="Arial"/>
+          <w:sz w:val="28"/>
+          <w:szCs w:val="28"/>
+        </w:rPr>
+        <w:t xml:space="preserve">Muchos datos de un solo golpe: En el proyecto 03, se </w:t>
+      </w:r>
+      <w:proofErr w:type="spellStart"/>
+      <w:r>
+        <w:rPr>
+          <w:rFonts w:ascii="Arial" w:hAnsi="Arial" w:cs="Arial"/>
+          <w:sz w:val="28"/>
+          <w:szCs w:val="28"/>
+        </w:rPr>
+        <w:t>ataco</w:t>
+      </w:r>
+      <w:proofErr w:type="spellEnd"/>
+      <w:r>
+        <w:rPr>
+          <w:rFonts w:ascii="Arial" w:hAnsi="Arial" w:cs="Arial"/>
+          <w:sz w:val="28"/>
+          <w:szCs w:val="28"/>
+        </w:rPr>
+        <w:t xml:space="preserve"> el problema de la </w:t>
+      </w:r>
+      <w:proofErr w:type="spellStart"/>
+      <w:r>
+        <w:rPr>
+          <w:rFonts w:ascii="Arial" w:hAnsi="Arial" w:cs="Arial"/>
+          <w:sz w:val="28"/>
+          <w:szCs w:val="28"/>
+        </w:rPr>
+        <w:t>duplicacion</w:t>
+      </w:r>
+      <w:proofErr w:type="spellEnd"/>
+      <w:r>
+        <w:rPr>
+          <w:rFonts w:ascii="Arial" w:hAnsi="Arial" w:cs="Arial"/>
+          <w:sz w:val="28"/>
+          <w:szCs w:val="28"/>
+        </w:rPr>
+        <w:t xml:space="preserve"> de </w:t>
+      </w:r>
+      <w:proofErr w:type="spellStart"/>
+      <w:r>
+        <w:rPr>
+          <w:rFonts w:ascii="Arial" w:hAnsi="Arial" w:cs="Arial"/>
+          <w:sz w:val="28"/>
+          <w:szCs w:val="28"/>
+        </w:rPr>
+        <w:t>codigo</w:t>
+      </w:r>
+      <w:proofErr w:type="spellEnd"/>
+      <w:r>
+        <w:rPr>
+          <w:rFonts w:ascii="Arial" w:hAnsi="Arial" w:cs="Arial"/>
+          <w:sz w:val="28"/>
+          <w:szCs w:val="28"/>
+        </w:rPr>
+        <w:t xml:space="preserve"> usando pruebas parametrizadas. En </w:t>
+      </w:r>
+      <w:proofErr w:type="spellStart"/>
+      <w:r>
+        <w:rPr>
+          <w:rFonts w:ascii="Arial" w:hAnsi="Arial" w:cs="Arial"/>
+          <w:sz w:val="28"/>
+          <w:szCs w:val="28"/>
+        </w:rPr>
+        <w:t>CsvSourceTest</w:t>
+      </w:r>
+      <w:proofErr w:type="spellEnd"/>
+      <w:r>
+        <w:rPr>
+          <w:rFonts w:ascii="Arial" w:hAnsi="Arial" w:cs="Arial"/>
+          <w:sz w:val="28"/>
+          <w:szCs w:val="28"/>
+        </w:rPr>
+        <w:t xml:space="preserve"> java se probaron decenas de fechas y limites, incluyendo el problema del 29 de febrero validando si el ano fue bisiesto o no separando el formato del significado real. Con solo treinta y dos </w:t>
+      </w:r>
+      <w:proofErr w:type="spellStart"/>
+      <w:r>
+        <w:rPr>
+          <w:rFonts w:ascii="Arial" w:hAnsi="Arial" w:cs="Arial"/>
+          <w:sz w:val="28"/>
+          <w:szCs w:val="28"/>
+        </w:rPr>
+        <w:t>metodos</w:t>
+      </w:r>
+      <w:proofErr w:type="spellEnd"/>
+      <w:r>
+        <w:rPr>
+          <w:rFonts w:ascii="Arial" w:hAnsi="Arial" w:cs="Arial"/>
+          <w:sz w:val="28"/>
+          <w:szCs w:val="28"/>
+        </w:rPr>
+        <w:t xml:space="preserve"> escritos a mano se lograron generar doscientos once </w:t>
+      </w:r>
+      <w:proofErr w:type="spellStart"/>
+      <w:r>
+        <w:rPr>
+          <w:rFonts w:ascii="Arial" w:hAnsi="Arial" w:cs="Arial"/>
+          <w:sz w:val="28"/>
+          <w:szCs w:val="28"/>
+        </w:rPr>
+        <w:t>tests</w:t>
+      </w:r>
+      <w:proofErr w:type="spellEnd"/>
+      <w:r>
+        <w:rPr>
+          <w:rFonts w:ascii="Arial" w:hAnsi="Arial" w:cs="Arial"/>
+          <w:sz w:val="28"/>
+          <w:szCs w:val="28"/>
+        </w:rPr>
+        <w:t xml:space="preserve"> reales.</w:t>
+      </w:r>
+    </w:p>
+    <w:p>
+      <w:pPr>
+        <w:spacing w:line="360" w:lineRule="auto"/>
+        <w:jc w:val="both"/>
+        <w:rPr>
+          <w:rFonts w:ascii="Arial" w:hAnsi="Arial" w:cs="Arial"/>
+          <w:sz w:val="28"/>
+          <w:szCs w:val="28"/>
+        </w:rPr>
+      </w:pPr>
+      <w:r>
+        <w:rPr>
+          <w:rFonts w:ascii="Arial" w:hAnsi="Arial" w:cs="Arial"/>
+          <w:sz w:val="28"/>
+          <w:szCs w:val="28"/>
+        </w:rPr>
+        <w:t>Aquí a continuación se mostrarán los scripts ejecutados para ver que pasaba en cada uno de los tres proyectos</w:t>
+      </w:r>
+      <w:r>
+        <w:rPr>
+          <w:rFonts w:ascii="Arial" w:hAnsi="Arial" w:cs="Arial"/>
+          <w:sz w:val="28"/>
+          <w:szCs w:val="28"/>
+        </w:rPr>
+        <w:t xml:space="preserve"> antes de todos se ejecuta el </w:t>
+      </w:r>
+      <w:proofErr w:type="gramStart"/>
+      <w:r>
+        <w:rPr>
+          <w:rFonts w:ascii="Arial" w:hAnsi="Arial" w:cs="Arial"/>
+          <w:sz w:val="28"/>
+          <w:szCs w:val="28"/>
+        </w:rPr>
+        <w:t>comando .</w:t>
+      </w:r>
+      <w:proofErr w:type="gramEnd"/>
+      <w:r>
+        <w:rPr>
+          <w:rFonts w:ascii="Arial" w:hAnsi="Arial" w:cs="Arial"/>
+          <w:sz w:val="28"/>
+          <w:szCs w:val="28"/>
+        </w:rPr>
+        <w:t>/</w:t>
+      </w:r>
+      <w:proofErr w:type="spellStart"/>
+      <w:r>
+        <w:rPr>
+          <w:rFonts w:ascii="Arial" w:hAnsi="Arial" w:cs="Arial"/>
+          <w:sz w:val="28"/>
+          <w:szCs w:val="28"/>
+        </w:rPr>
+        <w:t>mvnw</w:t>
+      </w:r>
+      <w:proofErr w:type="spellEnd"/>
+      <w:r>
+        <w:rPr>
+          <w:rFonts w:ascii="Arial" w:hAnsi="Arial" w:cs="Arial"/>
+          <w:sz w:val="28"/>
+          <w:szCs w:val="28"/>
+        </w:rPr>
+        <w:t xml:space="preserve"> test para ver el antes y después de los scripts</w:t>
+      </w:r>
+      <w:r>
+        <w:rPr>
+          <w:rFonts w:ascii="Arial" w:hAnsi="Arial" w:cs="Arial"/>
+          <w:sz w:val="28"/>
+          <w:szCs w:val="28"/>
+        </w:rPr>
+        <w:t>.</w:t>
+      </w:r>
+      <w:r>
+        <w:rPr>
+          <w:rFonts w:ascii="Arial" w:hAnsi="Arial" w:cs="Arial"/>
+          <w:sz w:val="28"/>
+          <w:szCs w:val="28"/>
+        </w:rPr>
+        <w:t xml:space="preserve"> </w:t>
+      </w:r>
+    </w:p>
+    <w:p>
+      <w:pPr>
+        <w:spacing w:line="360" w:lineRule="auto"/>
+        <w:jc w:val="both"/>
+        <w:rPr>
+          <w:rFonts w:ascii="Arial" w:hAnsi="Arial" w:cs="Arial"/>
+          <w:sz w:val="28"/>
+          <w:szCs w:val="28"/>
+        </w:rPr>
+      </w:pPr>
+      <w:r>
+        <w:rPr>
+          <w:rFonts w:ascii="Arial" w:hAnsi="Arial" w:cs="Arial"/>
+          <w:sz w:val="28"/>
+          <w:szCs w:val="28"/>
+        </w:rPr>
+        <w:t xml:space="preserve">En el primer proyecto llamado 01-junit-fundamentos </w:t>
+      </w:r>
+      <w:r>
+        <w:rPr>
+          <w:rFonts w:ascii="Arial" w:hAnsi="Arial" w:cs="Arial"/>
+          <w:sz w:val="28"/>
+          <w:szCs w:val="28"/>
+        </w:rPr>
+        <w:t>Se nos d</w:t>
+      </w:r>
+      <w:r>
+        <w:rPr>
+          <w:rFonts w:ascii="Arial" w:hAnsi="Arial" w:cs="Arial"/>
+          <w:sz w:val="28"/>
+          <w:szCs w:val="28"/>
+        </w:rPr>
+        <w:t xml:space="preserve">emuestra que el proyecto compilo correctamente descargando todas sus dependencias y ejecutando los </w:t>
+      </w:r>
+      <w:proofErr w:type="spellStart"/>
+      <w:r>
+        <w:rPr>
+          <w:rFonts w:ascii="Arial" w:hAnsi="Arial" w:cs="Arial"/>
+          <w:sz w:val="28"/>
+          <w:szCs w:val="28"/>
+        </w:rPr>
+        <w:t>veintidos</w:t>
+      </w:r>
+      <w:proofErr w:type="spellEnd"/>
+      <w:r>
+        <w:rPr>
+          <w:rFonts w:ascii="Arial" w:hAnsi="Arial" w:cs="Arial"/>
+          <w:sz w:val="28"/>
+          <w:szCs w:val="28"/>
+        </w:rPr>
+        <w:t xml:space="preserve"> </w:t>
+      </w:r>
+      <w:proofErr w:type="spellStart"/>
+      <w:r>
+        <w:rPr>
+          <w:rFonts w:ascii="Arial" w:hAnsi="Arial" w:cs="Arial"/>
+          <w:sz w:val="28"/>
+          <w:szCs w:val="28"/>
+        </w:rPr>
+        <w:t>tests</w:t>
+      </w:r>
+      <w:proofErr w:type="spellEnd"/>
+      <w:r>
+        <w:rPr>
+          <w:rFonts w:ascii="Arial" w:hAnsi="Arial" w:cs="Arial"/>
+          <w:sz w:val="28"/>
+          <w:szCs w:val="28"/>
+        </w:rPr>
+        <w:t xml:space="preserve"> originales con total </w:t>
+      </w:r>
+      <w:proofErr w:type="spellStart"/>
+      <w:r>
+        <w:rPr>
+          <w:rFonts w:ascii="Arial" w:hAnsi="Arial" w:cs="Arial"/>
+          <w:sz w:val="28"/>
+          <w:szCs w:val="28"/>
+        </w:rPr>
+        <w:t>exito</w:t>
+      </w:r>
+      <w:proofErr w:type="spellEnd"/>
+      <w:r>
+        <w:rPr>
+          <w:rFonts w:ascii="Arial" w:hAnsi="Arial" w:cs="Arial"/>
+          <w:sz w:val="28"/>
+          <w:szCs w:val="28"/>
+        </w:rPr>
+        <w:t>.</w:t>
+      </w:r>
+    </w:p>
+    <w:p>
+      <w:pPr>
+        <w:spacing w:line="360" w:lineRule="auto"/>
+        <w:jc w:val="both"/>
+        <w:rPr>
+          <w:rFonts w:ascii="Arial" w:hAnsi="Arial" w:cs="Arial"/>
+          <w:sz w:val="28"/>
+          <w:szCs w:val="28"/>
+        </w:rPr>
+      </w:pPr>
+      <w:r>
+        <w:rPr>
+          <w:rFonts w:ascii="Arial" w:hAnsi="Arial" w:cs="Arial"/>
+          <w:sz w:val="28"/>
+          <w:szCs w:val="28"/>
+        </w:rPr>
+        <w:lastRenderedPageBreak/>
+        <w:drawing>
+          <wp:inline distT="0" distB="0" distL="0" distR="0" wp14:anchorId="3779460E" wp14:editId="1AEC58C8">
+            <wp:extent cx="5612130" cy="2776220"/>
+            <wp:effectExtent l="0" t="0" r="7620" b="5080"/>
+            <wp:docPr id="1556986806" name="Imagen 1"/>
+            <wp:cNvGraphicFramePr>
+              <a:graphicFrameLocks xmlns:a="http://schemas.openxmlformats.org/drawingml/2006/main" noChangeAspect="1"/>
+            </wp:cNvGraphicFramePr>
+            <a:graphic xmlns:a="http://schemas.openxmlformats.org/drawingml/2006/main">
+              <a:graphicData uri="http://schemas.openxmlformats.org/drawingml/2006/picture">
+                <pic:pic xmlns:pic="http://schemas.openxmlformats.org/drawingml/2006/picture">
+                  <pic:nvPicPr>
+                    <pic:cNvPr id="1556986806" name=""/>
+                    <pic:cNvPicPr/>
+                  </pic:nvPicPr>
+                  <pic:blipFill>
+                    <a:blip r:embed="rId7"/>
+                    <a:stretch>
+                      <a:fillRect/>
+                    </a:stretch>
+                  </pic:blipFill>
+                  <pic:spPr>
+                    <a:xfrm>
+                      <a:off x="0" y="0"/>
+                      <a:ext cx="5612130" cy="2776220"/>
+                    </a:xfrm>
+                    <a:prstGeom prst="rect">
+                      <a:avLst/>
+                    </a:prstGeom>
+                  </pic:spPr>
+                </pic:pic>
+              </a:graphicData>
+            </a:graphic>
+          </wp:inline>
+        </w:drawing>
+      </w:r>
+    </w:p>
+    <w:p>
+      <w:pPr>
+        <w:spacing w:line="360" w:lineRule="auto"/>
+        <w:jc w:val="both"/>
+        <w:rPr>
+          <w:rFonts w:ascii="Arial" w:hAnsi="Arial" w:cs="Arial"/>
+          <w:sz w:val="28"/>
+          <w:szCs w:val="28"/>
+        </w:rPr>
+      </w:pPr>
+      <w:r>
+        <w:rPr>
+          <w:rFonts w:ascii="Arial" w:hAnsi="Arial" w:cs="Arial"/>
+          <w:sz w:val="28"/>
+          <w:szCs w:val="28"/>
+        </w:rPr>
+        <w:t>Aquí después se ejecuto el script de ver-fallar.sh.</w:t>
+      </w:r>
+    </w:p>
+    <w:p>
+      <w:pPr>
+        <w:spacing w:line="360" w:lineRule="auto"/>
+        <w:jc w:val="both"/>
+        <w:rPr>
+          <w:rFonts w:ascii="Arial" w:hAnsi="Arial" w:cs="Arial"/>
+          <w:sz w:val="28"/>
+          <w:szCs w:val="28"/>
+        </w:rPr>
+      </w:pPr>
+      <w:r>
+        <w:rPr>
+          <w:rFonts w:ascii="Arial" w:hAnsi="Arial" w:cs="Arial"/>
+          <w:sz w:val="28"/>
+          <w:szCs w:val="28"/>
+        </w:rPr>
+        <w:drawing>
+          <wp:inline distT="0" distB="0" distL="0" distR="0" wp14:anchorId="2076D0B3" wp14:editId="21CB4CB8">
+            <wp:extent cx="5612130" cy="2544445"/>
+            <wp:effectExtent l="0" t="0" r="7620" b="8255"/>
+            <wp:docPr id="1579844615" name="Imagen 1"/>
+            <wp:cNvGraphicFramePr>
+              <a:graphicFrameLocks xmlns:a="http://schemas.openxmlformats.org/drawingml/2006/main" noChangeAspect="1"/>
+            </wp:cNvGraphicFramePr>
+            <a:graphic xmlns:a="http://schemas.openxmlformats.org/drawingml/2006/main">
+              <a:graphicData uri="http://schemas.openxmlformats.org/drawingml/2006/picture">
+                <pic:pic xmlns:pic="http://schemas.openxmlformats.org/drawingml/2006/picture">
+                  <pic:nvPicPr>
+                    <pic:cNvPr id="1579844615" name=""/>
+                    <pic:cNvPicPr/>
+                  </pic:nvPicPr>
+                  <pic:blipFill>
+                    <a:blip r:embed="rId8"/>
+                    <a:stretch>
+                      <a:fillRect/>
+                    </a:stretch>
+                  </pic:blipFill>
+                  <pic:spPr>
+                    <a:xfrm>
+                      <a:off x="0" y="0"/>
+                      <a:ext cx="5612130" cy="2544445"/>
+                    </a:xfrm>
+                    <a:prstGeom prst="rect">
+                      <a:avLst/>
+                    </a:prstGeom>
+                  </pic:spPr>
+                </pic:pic>
+              </a:graphicData>
+            </a:graphic>
+          </wp:inline>
+        </w:drawing>
+      </w:r>
+    </w:p>
+    <w:p>
+      <w:pPr>
+        <w:spacing w:line="360" w:lineRule="auto"/>
+        <w:jc w:val="both"/>
+        <w:rPr>
+          <w:rFonts w:ascii="Arial" w:hAnsi="Arial" w:cs="Arial"/>
+          <w:sz w:val="28"/>
+          <w:szCs w:val="28"/>
+        </w:rPr>
+      </w:pPr>
+      <w:r>
+        <w:rPr>
+          <w:rFonts w:ascii="Arial" w:hAnsi="Arial" w:cs="Arial"/>
+          <w:sz w:val="28"/>
+          <w:szCs w:val="28"/>
+        </w:rPr>
+        <w:t xml:space="preserve">Esta imagen demuestra que tener </w:t>
+      </w:r>
+      <w:r>
+        <w:rPr>
+          <w:rFonts w:ascii="Arial" w:hAnsi="Arial" w:cs="Arial"/>
+          <w:sz w:val="28"/>
+          <w:szCs w:val="28"/>
+        </w:rPr>
+        <w:t>todo</w:t>
+      </w:r>
+      <w:r>
+        <w:rPr>
+          <w:rFonts w:ascii="Arial" w:hAnsi="Arial" w:cs="Arial"/>
+          <w:sz w:val="28"/>
+          <w:szCs w:val="28"/>
+        </w:rPr>
+        <w:t xml:space="preserve"> en verde no asegura la ausencia de errores. Al </w:t>
+      </w:r>
+      <w:r>
+        <w:rPr>
+          <w:rFonts w:ascii="Arial" w:hAnsi="Arial" w:cs="Arial"/>
+          <w:sz w:val="28"/>
+          <w:szCs w:val="28"/>
+        </w:rPr>
+        <w:t>meter</w:t>
+      </w:r>
+      <w:r>
+        <w:rPr>
+          <w:rFonts w:ascii="Arial" w:hAnsi="Arial" w:cs="Arial"/>
+          <w:sz w:val="28"/>
+          <w:szCs w:val="28"/>
+        </w:rPr>
+        <w:t xml:space="preserve"> un error en la </w:t>
+      </w:r>
+      <w:proofErr w:type="spellStart"/>
+      <w:r>
+        <w:rPr>
+          <w:rFonts w:ascii="Arial" w:hAnsi="Arial" w:cs="Arial"/>
+          <w:sz w:val="28"/>
+          <w:szCs w:val="28"/>
+        </w:rPr>
+        <w:t>logica</w:t>
+      </w:r>
+      <w:proofErr w:type="spellEnd"/>
+      <w:r>
+        <w:rPr>
+          <w:rFonts w:ascii="Arial" w:hAnsi="Arial" w:cs="Arial"/>
+          <w:sz w:val="28"/>
+          <w:szCs w:val="28"/>
+        </w:rPr>
+        <w:t xml:space="preserve">, la </w:t>
+      </w:r>
+      <w:proofErr w:type="spellStart"/>
+      <w:r>
+        <w:rPr>
+          <w:rFonts w:ascii="Arial" w:hAnsi="Arial" w:cs="Arial"/>
+          <w:sz w:val="28"/>
+          <w:szCs w:val="28"/>
+        </w:rPr>
+        <w:t>mayoria</w:t>
+      </w:r>
+      <w:proofErr w:type="spellEnd"/>
+      <w:r>
+        <w:rPr>
+          <w:rFonts w:ascii="Arial" w:hAnsi="Arial" w:cs="Arial"/>
+          <w:sz w:val="28"/>
+          <w:szCs w:val="28"/>
+        </w:rPr>
+        <w:t xml:space="preserve"> de las pruebas pasaron porque evaluaban valores </w:t>
+      </w:r>
+      <w:r>
+        <w:rPr>
+          <w:rFonts w:ascii="Arial" w:hAnsi="Arial" w:cs="Arial"/>
+          <w:sz w:val="28"/>
+          <w:szCs w:val="28"/>
+        </w:rPr>
+        <w:t>seguros</w:t>
+      </w:r>
+      <w:r>
+        <w:rPr>
+          <w:rFonts w:ascii="Arial" w:hAnsi="Arial" w:cs="Arial"/>
+          <w:sz w:val="28"/>
+          <w:szCs w:val="28"/>
+        </w:rPr>
+        <w:t xml:space="preserve">. Solo las pruebas </w:t>
+      </w:r>
+      <w:r>
+        <w:rPr>
+          <w:rFonts w:ascii="Arial" w:hAnsi="Arial" w:cs="Arial"/>
+          <w:sz w:val="28"/>
+          <w:szCs w:val="28"/>
+        </w:rPr>
+        <w:t>diseñadas</w:t>
+      </w:r>
+      <w:r>
+        <w:rPr>
+          <w:rFonts w:ascii="Arial" w:hAnsi="Arial" w:cs="Arial"/>
+          <w:sz w:val="28"/>
+          <w:szCs w:val="28"/>
+        </w:rPr>
+        <w:t xml:space="preserve"> exactamente en el </w:t>
+      </w:r>
+      <w:proofErr w:type="spellStart"/>
+      <w:r>
+        <w:rPr>
+          <w:rFonts w:ascii="Arial" w:hAnsi="Arial" w:cs="Arial"/>
+          <w:sz w:val="28"/>
+          <w:szCs w:val="28"/>
+        </w:rPr>
+        <w:t>limite</w:t>
+      </w:r>
+      <w:proofErr w:type="spellEnd"/>
+      <w:r>
+        <w:rPr>
+          <w:rFonts w:ascii="Arial" w:hAnsi="Arial" w:cs="Arial"/>
+          <w:sz w:val="28"/>
+          <w:szCs w:val="28"/>
+        </w:rPr>
+        <w:t xml:space="preserve"> detectaron la falla.</w:t>
+      </w:r>
+    </w:p>
+    <w:p>
+      <w:pPr>
+        <w:spacing w:line="360" w:lineRule="auto"/>
+        <w:jc w:val="both"/>
+        <w:rPr>
+          <w:rFonts w:ascii="Arial" w:hAnsi="Arial" w:cs="Arial"/>
+          <w:sz w:val="28"/>
+          <w:szCs w:val="28"/>
+        </w:rPr>
+      </w:pPr>
+      <w:r>
+        <w:rPr>
+          <w:rFonts w:ascii="Arial" w:hAnsi="Arial" w:cs="Arial"/>
+          <w:sz w:val="28"/>
+          <w:szCs w:val="28"/>
+        </w:rPr>
+        <w:lastRenderedPageBreak/>
+        <w:t>Aquí va la ejecución del segundo proyecto 02-junit-catalogo antes del script el cual se ejecutaron todos los test correctamente y pasaron todos.</w:t>
+      </w:r>
+    </w:p>
+    <w:p>
+      <w:pPr>
+        <w:spacing w:line="360" w:lineRule="auto"/>
+        <w:jc w:val="both"/>
+        <w:rPr>
+          <w:rFonts w:ascii="Arial" w:hAnsi="Arial" w:cs="Arial"/>
+          <w:sz w:val="28"/>
+          <w:szCs w:val="28"/>
+        </w:rPr>
+      </w:pPr>
+      <w:r>
+        <w:rPr>
+          <w:rFonts w:ascii="Arial" w:hAnsi="Arial" w:cs="Arial"/>
+          <w:sz w:val="28"/>
+          <w:szCs w:val="28"/>
+        </w:rPr>
+        <w:drawing>
+          <wp:inline distT="0" distB="0" distL="0" distR="0" wp14:anchorId="494D012E" wp14:editId="3ADA26D7">
+            <wp:extent cx="5612130" cy="3048635"/>
+            <wp:effectExtent l="0" t="0" r="7620" b="0"/>
+            <wp:docPr id="1103828239" name="Imagen 1"/>
+            <wp:cNvGraphicFramePr>
+              <a:graphicFrameLocks xmlns:a="http://schemas.openxmlformats.org/drawingml/2006/main" noChangeAspect="1"/>
+            </wp:cNvGraphicFramePr>
+            <a:graphic xmlns:a="http://schemas.openxmlformats.org/drawingml/2006/main">
+              <a:graphicData uri="http://schemas.openxmlformats.org/drawingml/2006/picture">
+                <pic:pic xmlns:pic="http://schemas.openxmlformats.org/drawingml/2006/picture">
+                  <pic:nvPicPr>
+                    <pic:cNvPr id="1103828239" name=""/>
+                    <pic:cNvPicPr/>
+                  </pic:nvPicPr>
+                  <pic:blipFill>
+                    <a:blip r:embed="rId9"/>
+                    <a:stretch>
+                      <a:fillRect/>
+                    </a:stretch>
+                  </pic:blipFill>
+                  <pic:spPr>
+                    <a:xfrm>
+                      <a:off x="0" y="0"/>
+                      <a:ext cx="5612130" cy="3048635"/>
+                    </a:xfrm>
+                    <a:prstGeom prst="rect">
+                      <a:avLst/>
+                    </a:prstGeom>
+                  </pic:spPr>
+                </pic:pic>
+              </a:graphicData>
+            </a:graphic>
+          </wp:inline>
+        </w:drawing>
+      </w:r>
+    </w:p>
+    <w:p>
+      <w:pPr>
+        <w:spacing w:line="360" w:lineRule="auto"/>
+        <w:jc w:val="both"/>
+        <w:rPr>
+          <w:rFonts w:ascii="Arial" w:hAnsi="Arial" w:cs="Arial"/>
+          <w:sz w:val="28"/>
+          <w:szCs w:val="28"/>
+        </w:rPr>
+      </w:pPr>
+      <w:r>
+        <w:rPr>
+          <w:rFonts w:ascii="Arial" w:hAnsi="Arial" w:cs="Arial"/>
+          <w:sz w:val="28"/>
+          <w:szCs w:val="28"/>
+        </w:rPr>
+        <w:t>Después se ejecuto el script contar.sh a ver que es lo que sucedió.</w:t>
+      </w:r>
+    </w:p>
+    <w:p>
+      <w:pPr>
+        <w:spacing w:line="360" w:lineRule="auto"/>
+        <w:jc w:val="both"/>
+        <w:rPr>
+          <w:rFonts w:ascii="Arial" w:hAnsi="Arial" w:cs="Arial"/>
+          <w:sz w:val="28"/>
+          <w:szCs w:val="28"/>
+        </w:rPr>
+      </w:pPr>
+      <w:r>
+        <w:rPr>
+          <w:rFonts w:ascii="Arial" w:hAnsi="Arial" w:cs="Arial"/>
+          <w:sz w:val="28"/>
+          <w:szCs w:val="28"/>
+        </w:rPr>
+        <w:drawing>
+          <wp:inline distT="0" distB="0" distL="0" distR="0" wp14:anchorId="5823EB31" wp14:editId="4E1C3E86">
+            <wp:extent cx="5612130" cy="2735580"/>
+            <wp:effectExtent l="0" t="0" r="7620" b="7620"/>
+            <wp:docPr id="2090804766" name="Imagen 1"/>
+            <wp:cNvGraphicFramePr>
+              <a:graphicFrameLocks xmlns:a="http://schemas.openxmlformats.org/drawingml/2006/main" noChangeAspect="1"/>
+            </wp:cNvGraphicFramePr>
+            <a:graphic xmlns:a="http://schemas.openxmlformats.org/drawingml/2006/main">
+              <a:graphicData uri="http://schemas.openxmlformats.org/drawingml/2006/picture">
+                <pic:pic xmlns:pic="http://schemas.openxmlformats.org/drawingml/2006/picture">
+                  <pic:nvPicPr>
+                    <pic:cNvPr id="2090804766" name=""/>
+                    <pic:cNvPicPr/>
+                  </pic:nvPicPr>
+                  <pic:blipFill>
+                    <a:blip r:embed="rId10"/>
+                    <a:stretch>
+                      <a:fillRect/>
+                    </a:stretch>
+                  </pic:blipFill>
+                  <pic:spPr>
+                    <a:xfrm>
+                      <a:off x="0" y="0"/>
+                      <a:ext cx="5612130" cy="2735580"/>
+                    </a:xfrm>
+                    <a:prstGeom prst="rect">
+                      <a:avLst/>
+                    </a:prstGeom>
+                  </pic:spPr>
+                </pic:pic>
+              </a:graphicData>
+            </a:graphic>
+          </wp:inline>
+        </w:drawing>
+      </w:r>
+    </w:p>
+    <w:p>
+      <w:pPr>
+        <w:spacing w:line="360" w:lineRule="auto"/>
+        <w:jc w:val="both"/>
+        <w:rPr>
+          <w:rFonts w:ascii="Arial" w:hAnsi="Arial" w:cs="Arial"/>
+          <w:sz w:val="28"/>
+          <w:szCs w:val="28"/>
+        </w:rPr>
+      </w:pPr>
+    </w:p>
+    <w:p>
+      <w:pPr>
+        <w:spacing w:line="360" w:lineRule="auto"/>
+        <w:jc w:val="both"/>
+        <w:rPr>
+          <w:rFonts w:ascii="Arial" w:hAnsi="Arial" w:cs="Arial"/>
+          <w:sz w:val="28"/>
+          <w:szCs w:val="28"/>
+        </w:rPr>
+      </w:pPr>
+    </w:p>
+    <w:p>
+      <w:pPr>
+        <w:spacing w:line="360" w:lineRule="auto"/>
+        <w:jc w:val="both"/>
+        <w:rPr>
+          <w:rFonts w:ascii="Arial" w:hAnsi="Arial" w:cs="Arial"/>
+          <w:sz w:val="28"/>
+          <w:szCs w:val="28"/>
+        </w:rPr>
+      </w:pPr>
+      <w:r>
+        <w:rPr>
+          <w:rFonts w:ascii="Arial" w:hAnsi="Arial" w:cs="Arial"/>
+          <w:sz w:val="28"/>
+          <w:szCs w:val="28"/>
+        </w:rPr>
+        <w:lastRenderedPageBreak/>
+        <w:t xml:space="preserve">Se </w:t>
+      </w:r>
+      <w:r>
+        <w:rPr>
+          <w:rFonts w:ascii="Arial" w:hAnsi="Arial" w:cs="Arial"/>
+          <w:sz w:val="28"/>
+          <w:szCs w:val="28"/>
+        </w:rPr>
+        <w:t xml:space="preserve">demuestra la importancia de clasificar las pruebas usando etiquetas para separar aquellas que consumen mucho tiempo de </w:t>
+      </w:r>
+      <w:proofErr w:type="spellStart"/>
+      <w:r>
+        <w:rPr>
+          <w:rFonts w:ascii="Arial" w:hAnsi="Arial" w:cs="Arial"/>
+          <w:sz w:val="28"/>
+          <w:szCs w:val="28"/>
+        </w:rPr>
+        <w:t>ejecucion</w:t>
+      </w:r>
+      <w:proofErr w:type="spellEnd"/>
+      <w:r>
+        <w:rPr>
+          <w:rFonts w:ascii="Arial" w:hAnsi="Arial" w:cs="Arial"/>
+          <w:sz w:val="28"/>
+          <w:szCs w:val="28"/>
+        </w:rPr>
+        <w:t xml:space="preserve">. </w:t>
+      </w:r>
+      <w:proofErr w:type="spellStart"/>
+      <w:r>
+        <w:rPr>
+          <w:rFonts w:ascii="Arial" w:hAnsi="Arial" w:cs="Arial"/>
+          <w:sz w:val="28"/>
+          <w:szCs w:val="28"/>
+        </w:rPr>
+        <w:t>Asi</w:t>
+      </w:r>
+      <w:proofErr w:type="spellEnd"/>
+      <w:r>
+        <w:rPr>
+          <w:rFonts w:ascii="Arial" w:hAnsi="Arial" w:cs="Arial"/>
+          <w:sz w:val="28"/>
+          <w:szCs w:val="28"/>
+        </w:rPr>
+        <w:t xml:space="preserve"> se pueden correr fracciones de la suite </w:t>
+      </w:r>
+      <w:r>
+        <w:rPr>
+          <w:rFonts w:ascii="Arial" w:hAnsi="Arial" w:cs="Arial"/>
+          <w:sz w:val="28"/>
+          <w:szCs w:val="28"/>
+        </w:rPr>
+        <w:t>mejorando</w:t>
+      </w:r>
+      <w:r>
+        <w:rPr>
+          <w:rFonts w:ascii="Arial" w:hAnsi="Arial" w:cs="Arial"/>
+          <w:sz w:val="28"/>
+          <w:szCs w:val="28"/>
+        </w:rPr>
+        <w:t xml:space="preserve"> el desarrollo continuo. </w:t>
+      </w:r>
+      <w:proofErr w:type="spellStart"/>
+      <w:r>
+        <w:rPr>
+          <w:rFonts w:ascii="Arial" w:hAnsi="Arial" w:cs="Arial"/>
+          <w:sz w:val="28"/>
+          <w:szCs w:val="28"/>
+        </w:rPr>
+        <w:t>Tambien</w:t>
+      </w:r>
+      <w:proofErr w:type="spellEnd"/>
+      <w:r>
+        <w:rPr>
+          <w:rFonts w:ascii="Arial" w:hAnsi="Arial" w:cs="Arial"/>
+          <w:sz w:val="28"/>
+          <w:szCs w:val="28"/>
+        </w:rPr>
+        <w:t xml:space="preserve"> se evidencia el uso de asunciones, donde cuatro pruebas fueron abortadas al no cumplir con las condiciones requeridas por el entorno, demostrando que un reporte verde puede esconder secciones de </w:t>
+      </w:r>
+      <w:proofErr w:type="spellStart"/>
+      <w:r>
+        <w:rPr>
+          <w:rFonts w:ascii="Arial" w:hAnsi="Arial" w:cs="Arial"/>
+          <w:sz w:val="28"/>
+          <w:szCs w:val="28"/>
+        </w:rPr>
+        <w:t>codigo</w:t>
+      </w:r>
+      <w:proofErr w:type="spellEnd"/>
+      <w:r>
+        <w:rPr>
+          <w:rFonts w:ascii="Arial" w:hAnsi="Arial" w:cs="Arial"/>
+          <w:sz w:val="28"/>
+          <w:szCs w:val="28"/>
+        </w:rPr>
+        <w:t xml:space="preserve"> sin evaluar si no se presta </w:t>
+      </w:r>
+      <w:proofErr w:type="spellStart"/>
+      <w:r>
+        <w:rPr>
+          <w:rFonts w:ascii="Arial" w:hAnsi="Arial" w:cs="Arial"/>
+          <w:sz w:val="28"/>
+          <w:szCs w:val="28"/>
+        </w:rPr>
+        <w:t>atencion</w:t>
+      </w:r>
+      <w:proofErr w:type="spellEnd"/>
+      <w:r>
+        <w:rPr>
+          <w:rFonts w:ascii="Arial" w:hAnsi="Arial" w:cs="Arial"/>
+          <w:sz w:val="28"/>
+          <w:szCs w:val="28"/>
+        </w:rPr>
+        <w:t xml:space="preserve"> a los saltos.</w:t>
+      </w:r>
+    </w:p>
+    <w:p>
+      <w:pPr>
+        <w:spacing w:line="360" w:lineRule="auto"/>
+        <w:jc w:val="both"/>
+        <w:rPr>
+          <w:rFonts w:ascii="Arial" w:hAnsi="Arial" w:cs="Arial"/>
+          <w:sz w:val="28"/>
+          <w:szCs w:val="28"/>
+        </w:rPr>
+      </w:pPr>
+      <w:r>
+        <w:rPr>
+          <w:rFonts w:ascii="Arial" w:hAnsi="Arial" w:cs="Arial"/>
+          <w:sz w:val="28"/>
+          <w:szCs w:val="28"/>
+        </w:rPr>
+        <w:t>Después</w:t>
+      </w:r>
+      <w:r>
+        <w:rPr>
+          <w:rFonts w:ascii="Arial" w:hAnsi="Arial" w:cs="Arial"/>
+          <w:sz w:val="28"/>
+          <w:szCs w:val="28"/>
+        </w:rPr>
+        <w:t xml:space="preserve"> va la ejecución del </w:t>
+      </w:r>
+      <w:r>
+        <w:rPr>
+          <w:rFonts w:ascii="Arial" w:hAnsi="Arial" w:cs="Arial"/>
+          <w:sz w:val="28"/>
+          <w:szCs w:val="28"/>
+        </w:rPr>
+        <w:t>tercer</w:t>
+      </w:r>
+      <w:r>
+        <w:rPr>
+          <w:rFonts w:ascii="Arial" w:hAnsi="Arial" w:cs="Arial"/>
+          <w:sz w:val="28"/>
+          <w:szCs w:val="28"/>
+        </w:rPr>
+        <w:t xml:space="preserve"> proyecto 0</w:t>
+      </w:r>
+      <w:r>
+        <w:rPr>
+          <w:rFonts w:ascii="Arial" w:hAnsi="Arial" w:cs="Arial"/>
+          <w:sz w:val="28"/>
+          <w:szCs w:val="28"/>
+        </w:rPr>
+        <w:t>3</w:t>
+      </w:r>
+      <w:r>
+        <w:rPr>
+          <w:rFonts w:ascii="Arial" w:hAnsi="Arial" w:cs="Arial"/>
+          <w:sz w:val="28"/>
+          <w:szCs w:val="28"/>
+        </w:rPr>
+        <w:t>-junit-</w:t>
+      </w:r>
+      <w:r>
+        <w:rPr>
+          <w:rFonts w:ascii="Arial" w:hAnsi="Arial" w:cs="Arial"/>
+          <w:sz w:val="28"/>
+          <w:szCs w:val="28"/>
+        </w:rPr>
+        <w:t>datos</w:t>
+      </w:r>
+      <w:r>
+        <w:rPr>
+          <w:rFonts w:ascii="Arial" w:hAnsi="Arial" w:cs="Arial"/>
+          <w:sz w:val="28"/>
+          <w:szCs w:val="28"/>
+        </w:rPr>
+        <w:t xml:space="preserve"> antes del script el cual se ejecutaron todos los test</w:t>
+      </w:r>
+      <w:r>
+        <w:rPr>
+          <w:rFonts w:ascii="Arial" w:hAnsi="Arial" w:cs="Arial"/>
+          <w:sz w:val="28"/>
+          <w:szCs w:val="28"/>
+        </w:rPr>
+        <w:t xml:space="preserve"> (211)</w:t>
+      </w:r>
+      <w:r>
+        <w:rPr>
+          <w:rFonts w:ascii="Arial" w:hAnsi="Arial" w:cs="Arial"/>
+          <w:sz w:val="28"/>
+          <w:szCs w:val="28"/>
+        </w:rPr>
+        <w:t xml:space="preserve"> correctamente y pasaron todos.</w:t>
+      </w:r>
+    </w:p>
+    <w:p>
+      <w:pPr>
+        <w:spacing w:line="360" w:lineRule="auto"/>
+        <w:jc w:val="both"/>
+        <w:rPr>
+          <w:rFonts w:ascii="Arial" w:hAnsi="Arial" w:cs="Arial"/>
+          <w:sz w:val="28"/>
+          <w:szCs w:val="28"/>
+        </w:rPr>
+      </w:pPr>
+      <w:r>
+        <w:rPr>
+          <w:rFonts w:ascii="Arial" w:hAnsi="Arial" w:cs="Arial"/>
+          <w:sz w:val="28"/>
+          <w:szCs w:val="28"/>
+        </w:rPr>
+        <w:drawing>
+          <wp:inline distT="0" distB="0" distL="0" distR="0" wp14:anchorId="1B5CB50B" wp14:editId="364DD012">
+            <wp:extent cx="5612130" cy="2205355"/>
+            <wp:effectExtent l="0" t="0" r="7620" b="4445"/>
+            <wp:docPr id="1606233009" name="Imagen 1"/>
+            <wp:cNvGraphicFramePr>
+              <a:graphicFrameLocks xmlns:a="http://schemas.openxmlformats.org/drawingml/2006/main" noChangeAspect="1"/>
+            </wp:cNvGraphicFramePr>
+            <a:graphic xmlns:a="http://schemas.openxmlformats.org/drawingml/2006/main">
+              <a:graphicData uri="http://schemas.openxmlformats.org/drawingml/2006/picture">
+                <pic:pic xmlns:pic="http://schemas.openxmlformats.org/drawingml/2006/picture">
+                  <pic:nvPicPr>
+                    <pic:cNvPr id="1606233009" name=""/>
+                    <pic:cNvPicPr/>
+                  </pic:nvPicPr>
+                  <pic:blipFill>
+                    <a:blip r:embed="rId11"/>
+                    <a:stretch>
+                      <a:fillRect/>
+                    </a:stretch>
+                  </pic:blipFill>
+                  <pic:spPr>
+                    <a:xfrm>
+                      <a:off x="0" y="0"/>
+                      <a:ext cx="5612130" cy="2205355"/>
+                    </a:xfrm>
+                    <a:prstGeom prst="rect">
+                      <a:avLst/>
+                    </a:prstGeom>
+                  </pic:spPr>
+                </pic:pic>
+              </a:graphicData>
+            </a:graphic>
+          </wp:inline>
+        </w:drawing>
+      </w:r>
+    </w:p>
+    <w:p>
+      <w:pPr>
+        <w:spacing w:line="360" w:lineRule="auto"/>
+        <w:jc w:val="both"/>
+        <w:rPr>
+          <w:rFonts w:ascii="Arial" w:hAnsi="Arial" w:cs="Arial"/>
+          <w:sz w:val="28"/>
+          <w:szCs w:val="28"/>
+        </w:rPr>
+      </w:pPr>
+      <w:r>
+        <w:rPr>
+          <w:rFonts w:ascii="Arial" w:hAnsi="Arial" w:cs="Arial"/>
+          <w:sz w:val="28"/>
+          <w:szCs w:val="28"/>
+        </w:rPr>
+        <w:t>Ahora se mostrará lo que sucede después de meterle el script de contar.sh.</w:t>
+      </w:r>
+    </w:p>
+    <w:p>
+      <w:pPr>
+        <w:spacing w:line="360" w:lineRule="auto"/>
+        <w:jc w:val="center"/>
+        <w:rPr>
+          <w:rFonts w:ascii="Arial" w:hAnsi="Arial" w:cs="Arial"/>
+          <w:sz w:val="28"/>
+          <w:szCs w:val="28"/>
+        </w:rPr>
+      </w:pPr>
+      <w:r>
+        <w:rPr>
+          <w:rFonts w:ascii="Arial" w:hAnsi="Arial" w:cs="Arial"/>
+          <w:sz w:val="28"/>
+          <w:szCs w:val="28"/>
+        </w:rPr>
+        <w:lastRenderedPageBreak/>
+        <w:drawing>
+          <wp:inline distT="0" distB="0" distL="0" distR="0" wp14:anchorId="66A73CE7" wp14:editId="5D3C4C74">
+            <wp:extent cx="5182049" cy="4229467"/>
+            <wp:effectExtent l="0" t="0" r="0" b="0"/>
+            <wp:docPr id="1025832694" name="Imagen 1"/>
+            <wp:cNvGraphicFramePr>
+              <a:graphicFrameLocks xmlns:a="http://schemas.openxmlformats.org/drawingml/2006/main" noChangeAspect="1"/>
+            </wp:cNvGraphicFramePr>
+            <a:graphic xmlns:a="http://schemas.openxmlformats.org/drawingml/2006/main">
+              <a:graphicData uri="http://schemas.openxmlformats.org/drawingml/2006/picture">
+                <pic:pic xmlns:pic="http://schemas.openxmlformats.org/drawingml/2006/picture">
+                  <pic:nvPicPr>
+                    <pic:cNvPr id="1025832694" name=""/>
+                    <pic:cNvPicPr/>
+                  </pic:nvPicPr>
+                  <pic:blipFill>
+                    <a:blip r:embed="rId12"/>
+                    <a:stretch>
+                      <a:fillRect/>
+                    </a:stretch>
+                  </pic:blipFill>
+                  <pic:spPr>
+                    <a:xfrm>
+                      <a:off x="0" y="0"/>
+                      <a:ext cx="5182049" cy="4229467"/>
+                    </a:xfrm>
+                    <a:prstGeom prst="rect">
+                      <a:avLst/>
+                    </a:prstGeom>
+                  </pic:spPr>
+                </pic:pic>
+              </a:graphicData>
+            </a:graphic>
+          </wp:inline>
+        </w:drawing>
+      </w:r>
+    </w:p>
+    <w:p>
+      <w:pPr>
+        <w:spacing w:line="360" w:lineRule="auto"/>
+        <w:jc w:val="both"/>
+        <w:rPr>
+          <w:rFonts w:ascii="Arial" w:hAnsi="Arial" w:cs="Arial"/>
+          <w:sz w:val="28"/>
+          <w:szCs w:val="28"/>
+        </w:rPr>
+      </w:pPr>
+      <w:r>
+        <w:rPr>
+          <w:rFonts w:ascii="Arial" w:hAnsi="Arial" w:cs="Arial"/>
+          <w:sz w:val="28"/>
+          <w:szCs w:val="28"/>
+        </w:rPr>
+        <w:t xml:space="preserve">Aquí se </w:t>
+      </w:r>
+      <w:r>
+        <w:rPr>
+          <w:rFonts w:ascii="Arial" w:hAnsi="Arial" w:cs="Arial"/>
+          <w:sz w:val="28"/>
+          <w:szCs w:val="28"/>
+        </w:rPr>
+        <w:t xml:space="preserve">demuestra la enorme ventaja de usar pruebas </w:t>
+      </w:r>
+      <w:r>
+        <w:rPr>
+          <w:rFonts w:ascii="Arial" w:hAnsi="Arial" w:cs="Arial"/>
+          <w:sz w:val="28"/>
+          <w:szCs w:val="28"/>
+        </w:rPr>
+        <w:t xml:space="preserve">con </w:t>
+      </w:r>
+      <w:proofErr w:type="spellStart"/>
+      <w:r>
+        <w:rPr>
+          <w:rFonts w:ascii="Arial" w:hAnsi="Arial" w:cs="Arial"/>
+          <w:sz w:val="28"/>
+          <w:szCs w:val="28"/>
+        </w:rPr>
+        <w:t>parametros</w:t>
+      </w:r>
+      <w:proofErr w:type="spellEnd"/>
+      <w:r>
+        <w:rPr>
+          <w:rFonts w:ascii="Arial" w:hAnsi="Arial" w:cs="Arial"/>
+          <w:sz w:val="28"/>
+          <w:szCs w:val="28"/>
+        </w:rPr>
+        <w:t xml:space="preserve"> para validar </w:t>
+      </w:r>
+      <w:proofErr w:type="spellStart"/>
+      <w:r>
+        <w:rPr>
+          <w:rFonts w:ascii="Arial" w:hAnsi="Arial" w:cs="Arial"/>
+          <w:sz w:val="28"/>
+          <w:szCs w:val="28"/>
+        </w:rPr>
+        <w:t>multiples</w:t>
+      </w:r>
+      <w:proofErr w:type="spellEnd"/>
+      <w:r>
+        <w:rPr>
+          <w:rFonts w:ascii="Arial" w:hAnsi="Arial" w:cs="Arial"/>
+          <w:sz w:val="28"/>
+          <w:szCs w:val="28"/>
+        </w:rPr>
+        <w:t xml:space="preserve"> variaciones de </w:t>
+      </w:r>
+      <w:proofErr w:type="spellStart"/>
+      <w:r>
+        <w:rPr>
+          <w:rFonts w:ascii="Arial" w:hAnsi="Arial" w:cs="Arial"/>
+          <w:sz w:val="28"/>
+          <w:szCs w:val="28"/>
+        </w:rPr>
+        <w:t>informacion</w:t>
+      </w:r>
+      <w:proofErr w:type="spellEnd"/>
+      <w:r>
+        <w:rPr>
+          <w:rFonts w:ascii="Arial" w:hAnsi="Arial" w:cs="Arial"/>
+          <w:sz w:val="28"/>
+          <w:szCs w:val="28"/>
+        </w:rPr>
+        <w:t xml:space="preserve">. El script comprueba que escribiendo tan solo treinta y dos </w:t>
+      </w:r>
+      <w:proofErr w:type="spellStart"/>
+      <w:r>
+        <w:rPr>
+          <w:rFonts w:ascii="Arial" w:hAnsi="Arial" w:cs="Arial"/>
+          <w:sz w:val="28"/>
+          <w:szCs w:val="28"/>
+        </w:rPr>
+        <w:t>metodos</w:t>
+      </w:r>
+      <w:proofErr w:type="spellEnd"/>
+      <w:r>
+        <w:rPr>
+          <w:rFonts w:ascii="Arial" w:hAnsi="Arial" w:cs="Arial"/>
+          <w:sz w:val="28"/>
+          <w:szCs w:val="28"/>
+        </w:rPr>
+        <w:t xml:space="preserve"> a mano se logran generar doscientos once </w:t>
+      </w:r>
+      <w:proofErr w:type="spellStart"/>
+      <w:r>
+        <w:rPr>
+          <w:rFonts w:ascii="Arial" w:hAnsi="Arial" w:cs="Arial"/>
+          <w:sz w:val="28"/>
+          <w:szCs w:val="28"/>
+        </w:rPr>
+        <w:t>tests</w:t>
+      </w:r>
+      <w:proofErr w:type="spellEnd"/>
+      <w:r>
+        <w:rPr>
+          <w:rFonts w:ascii="Arial" w:hAnsi="Arial" w:cs="Arial"/>
+          <w:sz w:val="28"/>
+          <w:szCs w:val="28"/>
+        </w:rPr>
+        <w:t xml:space="preserve"> completamente independientes al momento de la </w:t>
+      </w:r>
+      <w:proofErr w:type="spellStart"/>
+      <w:r>
+        <w:rPr>
+          <w:rFonts w:ascii="Arial" w:hAnsi="Arial" w:cs="Arial"/>
+          <w:sz w:val="28"/>
+          <w:szCs w:val="28"/>
+        </w:rPr>
+        <w:t>ejecucion</w:t>
+      </w:r>
+      <w:proofErr w:type="spellEnd"/>
+      <w:r>
+        <w:rPr>
+          <w:rFonts w:ascii="Arial" w:hAnsi="Arial" w:cs="Arial"/>
+          <w:sz w:val="28"/>
+          <w:szCs w:val="28"/>
+        </w:rPr>
+        <w:t xml:space="preserve">. Esto se logra </w:t>
+      </w:r>
+      <w:r>
+        <w:rPr>
+          <w:rFonts w:ascii="Arial" w:hAnsi="Arial" w:cs="Arial"/>
+          <w:sz w:val="28"/>
+          <w:szCs w:val="28"/>
+        </w:rPr>
+        <w:t>metiendo</w:t>
+      </w:r>
+      <w:r>
+        <w:rPr>
+          <w:rFonts w:ascii="Arial" w:hAnsi="Arial" w:cs="Arial"/>
+          <w:sz w:val="28"/>
+          <w:szCs w:val="28"/>
+        </w:rPr>
+        <w:t xml:space="preserve"> diversas fuentes de datos permitiendo probar todos los escenarios </w:t>
+      </w:r>
+      <w:proofErr w:type="spellStart"/>
+      <w:r>
+        <w:rPr>
+          <w:rFonts w:ascii="Arial" w:hAnsi="Arial" w:cs="Arial"/>
+          <w:sz w:val="28"/>
+          <w:szCs w:val="28"/>
+        </w:rPr>
+        <w:t>invalidos</w:t>
+      </w:r>
+      <w:proofErr w:type="spellEnd"/>
+      <w:r>
+        <w:rPr>
+          <w:rFonts w:ascii="Arial" w:hAnsi="Arial" w:cs="Arial"/>
+          <w:sz w:val="28"/>
+          <w:szCs w:val="28"/>
+        </w:rPr>
+        <w:t xml:space="preserve"> y casos limite sin tener que duplicar </w:t>
+      </w:r>
+      <w:proofErr w:type="spellStart"/>
+      <w:r>
+        <w:rPr>
+          <w:rFonts w:ascii="Arial" w:hAnsi="Arial" w:cs="Arial"/>
+          <w:sz w:val="28"/>
+          <w:szCs w:val="28"/>
+        </w:rPr>
+        <w:t>lineas</w:t>
+      </w:r>
+      <w:proofErr w:type="spellEnd"/>
+      <w:r>
+        <w:rPr>
+          <w:rFonts w:ascii="Arial" w:hAnsi="Arial" w:cs="Arial"/>
+          <w:sz w:val="28"/>
+          <w:szCs w:val="28"/>
+        </w:rPr>
+        <w:t xml:space="preserve"> de </w:t>
+      </w:r>
+      <w:proofErr w:type="spellStart"/>
+      <w:r>
+        <w:rPr>
+          <w:rFonts w:ascii="Arial" w:hAnsi="Arial" w:cs="Arial"/>
+          <w:sz w:val="28"/>
+          <w:szCs w:val="28"/>
+        </w:rPr>
+        <w:t>codigo</w:t>
+      </w:r>
+      <w:proofErr w:type="spellEnd"/>
+      <w:r>
+        <w:rPr>
+          <w:rFonts w:ascii="Arial" w:hAnsi="Arial" w:cs="Arial"/>
+          <w:sz w:val="28"/>
+          <w:szCs w:val="28"/>
+        </w:rPr>
+        <w:t xml:space="preserve"> </w:t>
+      </w:r>
+      <w:r>
+        <w:rPr>
+          <w:rFonts w:ascii="Arial" w:hAnsi="Arial" w:cs="Arial"/>
+          <w:sz w:val="28"/>
+          <w:szCs w:val="28"/>
+        </w:rPr>
+        <w:t>teniendo</w:t>
+      </w:r>
+      <w:r>
+        <w:rPr>
+          <w:rFonts w:ascii="Arial" w:hAnsi="Arial" w:cs="Arial"/>
+          <w:sz w:val="28"/>
+          <w:szCs w:val="28"/>
+        </w:rPr>
+        <w:t xml:space="preserve"> un mantenimiento </w:t>
+      </w:r>
+      <w:r>
+        <w:rPr>
+          <w:rFonts w:ascii="Arial" w:hAnsi="Arial" w:cs="Arial"/>
+          <w:sz w:val="28"/>
+          <w:szCs w:val="28"/>
+        </w:rPr>
+        <w:t>bajo</w:t>
+      </w:r>
+      <w:r>
+        <w:rPr>
+          <w:rFonts w:ascii="Arial" w:hAnsi="Arial" w:cs="Arial"/>
+          <w:sz w:val="28"/>
+          <w:szCs w:val="28"/>
+        </w:rPr>
+        <w:t>.</w:t>
+      </w:r>
+    </w:p>
+    <w:p>
+      <w:pPr>
+        <w:spacing w:line="360" w:lineRule="auto"/>
+        <w:jc w:val="both"/>
+        <w:rPr>
+          <w:rFonts w:ascii="Arial" w:hAnsi="Arial" w:cs="Arial"/>
+          <w:sz w:val="28"/>
+          <w:szCs w:val="28"/>
+        </w:rPr>
+      </w:pPr>
+    </w:p>
+    <w:p>
+      <w:pPr>
+        <w:spacing w:line="360" w:lineRule="auto"/>
+        <w:jc w:val="both"/>
+        <w:rPr>
+          <w:rFonts w:ascii="Arial" w:hAnsi="Arial" w:cs="Arial"/>
+          <w:sz w:val="28"/>
+          <w:szCs w:val="28"/>
+        </w:rPr>
+      </w:pPr>
+    </w:p>
+    <w:p>
+      <w:pPr>
+        <w:spacing w:line="360" w:lineRule="auto"/>
+        <w:jc w:val="both"/>
+        <w:rPr>
+          <w:rFonts w:ascii="Arial" w:hAnsi="Arial" w:cs="Arial"/>
+          <w:sz w:val="28"/>
+          <w:szCs w:val="28"/>
+        </w:rPr>
+      </w:pPr>
+    </w:p>
+    <w:p>
+      <w:pPr>
+        <w:spacing w:line="360" w:lineRule="auto"/>
+        <w:jc w:val="both"/>
+        <w:rPr>
+          <w:rFonts w:ascii="Arial" w:hAnsi="Arial" w:cs="Arial"/>
+          <w:sz w:val="28"/>
+          <w:szCs w:val="28"/>
+        </w:rPr>
+      </w:pPr>
+    </w:p>
+    <w:p>
+      <w:pPr>
+        <w:spacing w:line="360" w:lineRule="auto"/>
+        <w:jc w:val="both"/>
+        <w:rPr>
+          <w:rFonts w:ascii="Arial" w:hAnsi="Arial" w:cs="Arial"/>
+          <w:sz w:val="28"/>
+          <w:szCs w:val="28"/>
+        </w:rPr>
+      </w:pPr>
+      <w:r>
+        <w:rPr>
+          <w:rFonts w:ascii="Arial" w:hAnsi="Arial" w:cs="Arial"/>
+          <w:sz w:val="28"/>
+          <w:szCs w:val="28"/>
+        </w:rPr>
+        <w:lastRenderedPageBreak/>
+        <w:t xml:space="preserve">Tener pruebas que pasan no significa estar protegido. En el primer proyecto se </w:t>
+      </w:r>
+      <w:proofErr w:type="spellStart"/>
+      <w:r>
+        <w:rPr>
+          <w:rFonts w:ascii="Arial" w:hAnsi="Arial" w:cs="Arial"/>
+          <w:sz w:val="28"/>
+          <w:szCs w:val="28"/>
+        </w:rPr>
+        <w:t>incluyo</w:t>
+      </w:r>
+      <w:proofErr w:type="spellEnd"/>
+      <w:r>
+        <w:rPr>
+          <w:rFonts w:ascii="Arial" w:hAnsi="Arial" w:cs="Arial"/>
+          <w:sz w:val="28"/>
+          <w:szCs w:val="28"/>
+        </w:rPr>
+        <w:t xml:space="preserve"> el script ver-fallar </w:t>
+      </w:r>
+      <w:proofErr w:type="spellStart"/>
+      <w:r>
+        <w:rPr>
+          <w:rFonts w:ascii="Arial" w:hAnsi="Arial" w:cs="Arial"/>
+          <w:sz w:val="28"/>
+          <w:szCs w:val="28"/>
+        </w:rPr>
+        <w:t>sh</w:t>
+      </w:r>
+      <w:proofErr w:type="spellEnd"/>
+      <w:r>
+        <w:rPr>
+          <w:rFonts w:ascii="Arial" w:hAnsi="Arial" w:cs="Arial"/>
+          <w:sz w:val="28"/>
+          <w:szCs w:val="28"/>
+        </w:rPr>
+        <w:t xml:space="preserve"> que introduce un bug cambiando un solo </w:t>
+      </w:r>
+      <w:proofErr w:type="spellStart"/>
+      <w:r>
+        <w:rPr>
+          <w:rFonts w:ascii="Arial" w:hAnsi="Arial" w:cs="Arial"/>
+          <w:sz w:val="28"/>
+          <w:szCs w:val="28"/>
+        </w:rPr>
+        <w:t>caracter</w:t>
+      </w:r>
+      <w:proofErr w:type="spellEnd"/>
+      <w:r>
+        <w:rPr>
+          <w:rFonts w:ascii="Arial" w:hAnsi="Arial" w:cs="Arial"/>
+          <w:sz w:val="28"/>
+          <w:szCs w:val="28"/>
+        </w:rPr>
+        <w:t xml:space="preserve"> de mayor o igual a mayor estricto en la regla de </w:t>
+      </w:r>
+      <w:proofErr w:type="spellStart"/>
+      <w:r>
+        <w:rPr>
+          <w:rFonts w:ascii="Arial" w:hAnsi="Arial" w:cs="Arial"/>
+          <w:sz w:val="28"/>
+          <w:szCs w:val="28"/>
+        </w:rPr>
+        <w:t>aprobacion</w:t>
+      </w:r>
+      <w:proofErr w:type="spellEnd"/>
+      <w:r>
+        <w:rPr>
+          <w:rFonts w:ascii="Arial" w:hAnsi="Arial" w:cs="Arial"/>
+          <w:sz w:val="28"/>
+          <w:szCs w:val="28"/>
+        </w:rPr>
+        <w:t xml:space="preserve">. Al ejecutar </w:t>
+      </w:r>
+      <w:r>
+        <w:rPr>
+          <w:rFonts w:ascii="Arial" w:hAnsi="Arial" w:cs="Arial"/>
+          <w:sz w:val="28"/>
+          <w:szCs w:val="28"/>
+        </w:rPr>
+        <w:t>el script</w:t>
+      </w:r>
+      <w:r>
+        <w:rPr>
+          <w:rFonts w:ascii="Arial" w:hAnsi="Arial" w:cs="Arial"/>
+          <w:sz w:val="28"/>
+          <w:szCs w:val="28"/>
+        </w:rPr>
+        <w:t xml:space="preserve">, veinte de </w:t>
+      </w:r>
+      <w:proofErr w:type="spellStart"/>
+      <w:r>
+        <w:rPr>
+          <w:rFonts w:ascii="Arial" w:hAnsi="Arial" w:cs="Arial"/>
+          <w:sz w:val="28"/>
+          <w:szCs w:val="28"/>
+        </w:rPr>
+        <w:t>veintidos</w:t>
+      </w:r>
+      <w:proofErr w:type="spellEnd"/>
+      <w:r>
+        <w:rPr>
+          <w:rFonts w:ascii="Arial" w:hAnsi="Arial" w:cs="Arial"/>
+          <w:sz w:val="28"/>
+          <w:szCs w:val="28"/>
+        </w:rPr>
+        <w:t xml:space="preserve"> pruebas siguieron pasando en color verde porque evaluaban casos lejanos al </w:t>
+      </w:r>
+      <w:proofErr w:type="spellStart"/>
+      <w:r>
+        <w:rPr>
+          <w:rFonts w:ascii="Arial" w:hAnsi="Arial" w:cs="Arial"/>
+          <w:sz w:val="28"/>
+          <w:szCs w:val="28"/>
+        </w:rPr>
+        <w:t>limite</w:t>
+      </w:r>
+      <w:proofErr w:type="spellEnd"/>
+      <w:r>
+        <w:rPr>
+          <w:rFonts w:ascii="Arial" w:hAnsi="Arial" w:cs="Arial"/>
+          <w:sz w:val="28"/>
+          <w:szCs w:val="28"/>
+        </w:rPr>
+        <w:t xml:space="preserve">. Solo cayeron las pruebas </w:t>
+      </w:r>
+      <w:r>
+        <w:rPr>
+          <w:rFonts w:ascii="Arial" w:hAnsi="Arial" w:cs="Arial"/>
+          <w:sz w:val="28"/>
+          <w:szCs w:val="28"/>
+        </w:rPr>
+        <w:t>diseñadas</w:t>
+      </w:r>
+      <w:r>
+        <w:rPr>
+          <w:rFonts w:ascii="Arial" w:hAnsi="Arial" w:cs="Arial"/>
+          <w:sz w:val="28"/>
+          <w:szCs w:val="28"/>
+        </w:rPr>
+        <w:t xml:space="preserve"> para evaluar exactamente</w:t>
+      </w:r>
+      <w:r>
+        <w:rPr>
+          <w:rFonts w:ascii="Arial" w:hAnsi="Arial" w:cs="Arial"/>
+          <w:sz w:val="28"/>
+          <w:szCs w:val="28"/>
+        </w:rPr>
+        <w:t xml:space="preserve"> el </w:t>
+      </w:r>
+      <w:proofErr w:type="spellStart"/>
+      <w:r>
+        <w:rPr>
+          <w:rFonts w:ascii="Arial" w:hAnsi="Arial" w:cs="Arial"/>
+          <w:sz w:val="28"/>
+          <w:szCs w:val="28"/>
+        </w:rPr>
+        <w:t>limite</w:t>
+      </w:r>
+      <w:proofErr w:type="spellEnd"/>
+      <w:r>
+        <w:rPr>
+          <w:rFonts w:ascii="Arial" w:hAnsi="Arial" w:cs="Arial"/>
+          <w:sz w:val="28"/>
+          <w:szCs w:val="28"/>
+        </w:rPr>
+        <w:t xml:space="preserve">. Esto demuestra </w:t>
+      </w:r>
+      <w:proofErr w:type="gramStart"/>
+      <w:r>
+        <w:rPr>
+          <w:rFonts w:ascii="Arial" w:hAnsi="Arial" w:cs="Arial"/>
+          <w:sz w:val="28"/>
+          <w:szCs w:val="28"/>
+        </w:rPr>
+        <w:t>que</w:t>
+      </w:r>
+      <w:proofErr w:type="gramEnd"/>
+      <w:r>
+        <w:rPr>
+          <w:rFonts w:ascii="Arial" w:hAnsi="Arial" w:cs="Arial"/>
+          <w:sz w:val="28"/>
+          <w:szCs w:val="28"/>
+        </w:rPr>
+        <w:t xml:space="preserve"> si los </w:t>
+      </w:r>
+      <w:proofErr w:type="spellStart"/>
+      <w:r>
+        <w:rPr>
+          <w:rFonts w:ascii="Arial" w:hAnsi="Arial" w:cs="Arial"/>
+          <w:sz w:val="28"/>
+          <w:szCs w:val="28"/>
+        </w:rPr>
+        <w:t>tests</w:t>
+      </w:r>
+      <w:proofErr w:type="spellEnd"/>
+      <w:r>
+        <w:rPr>
+          <w:rFonts w:ascii="Arial" w:hAnsi="Arial" w:cs="Arial"/>
+          <w:sz w:val="28"/>
+          <w:szCs w:val="28"/>
+        </w:rPr>
+        <w:t xml:space="preserve"> no caen al romper el </w:t>
+      </w:r>
+      <w:proofErr w:type="spellStart"/>
+      <w:r>
+        <w:rPr>
+          <w:rFonts w:ascii="Arial" w:hAnsi="Arial" w:cs="Arial"/>
+          <w:sz w:val="28"/>
+          <w:szCs w:val="28"/>
+        </w:rPr>
+        <w:t>codigo</w:t>
+      </w:r>
+      <w:proofErr w:type="spellEnd"/>
+      <w:r>
+        <w:rPr>
+          <w:rFonts w:ascii="Arial" w:hAnsi="Arial" w:cs="Arial"/>
+          <w:sz w:val="28"/>
+          <w:szCs w:val="28"/>
+        </w:rPr>
+        <w:t xml:space="preserve"> a </w:t>
+      </w:r>
+      <w:proofErr w:type="spellStart"/>
+      <w:r>
+        <w:rPr>
+          <w:rFonts w:ascii="Arial" w:hAnsi="Arial" w:cs="Arial"/>
+          <w:sz w:val="28"/>
+          <w:szCs w:val="28"/>
+        </w:rPr>
+        <w:t>proposito</w:t>
+      </w:r>
+      <w:proofErr w:type="spellEnd"/>
+      <w:r>
+        <w:rPr>
+          <w:rFonts w:ascii="Arial" w:hAnsi="Arial" w:cs="Arial"/>
+          <w:sz w:val="28"/>
+          <w:szCs w:val="28"/>
+        </w:rPr>
+        <w:t xml:space="preserve">, realmente no </w:t>
+      </w:r>
+      <w:proofErr w:type="spellStart"/>
+      <w:r>
+        <w:rPr>
+          <w:rFonts w:ascii="Arial" w:hAnsi="Arial" w:cs="Arial"/>
+          <w:sz w:val="28"/>
+          <w:szCs w:val="28"/>
+        </w:rPr>
+        <w:t>estan</w:t>
+      </w:r>
+      <w:proofErr w:type="spellEnd"/>
+      <w:r>
+        <w:rPr>
+          <w:rFonts w:ascii="Arial" w:hAnsi="Arial" w:cs="Arial"/>
+          <w:sz w:val="28"/>
+          <w:szCs w:val="28"/>
+        </w:rPr>
+        <w:t xml:space="preserve"> probando nada.</w:t>
+      </w:r>
+    </w:p>
+    <w:p>
+      <w:pPr>
+        <w:spacing w:line="360" w:lineRule="auto"/>
+        <w:jc w:val="both"/>
+        <w:rPr>
+          <w:rFonts w:ascii="Arial" w:hAnsi="Arial" w:cs="Arial"/>
+          <w:sz w:val="28"/>
+          <w:szCs w:val="28"/>
+        </w:rPr>
+      </w:pPr>
+      <w:r>
+        <w:rPr>
+          <w:rFonts w:ascii="Arial" w:hAnsi="Arial" w:cs="Arial"/>
+          <w:sz w:val="28"/>
+          <w:szCs w:val="28"/>
+        </w:rPr>
+        <w:t xml:space="preserve">Si no se usa </w:t>
+      </w:r>
+      <w:proofErr w:type="spellStart"/>
+      <w:r>
+        <w:rPr>
+          <w:rFonts w:ascii="Arial" w:hAnsi="Arial" w:cs="Arial"/>
+          <w:sz w:val="28"/>
+          <w:szCs w:val="28"/>
+        </w:rPr>
+        <w:t>JUnit</w:t>
+      </w:r>
+      <w:proofErr w:type="spellEnd"/>
+      <w:r>
+        <w:rPr>
+          <w:rFonts w:ascii="Arial" w:hAnsi="Arial" w:cs="Arial"/>
+          <w:sz w:val="28"/>
+          <w:szCs w:val="28"/>
+        </w:rPr>
+        <w:t xml:space="preserve"> o si solo pruebas casos felices, el equipo de desarrollo </w:t>
+      </w:r>
+      <w:proofErr w:type="spellStart"/>
+      <w:r>
+        <w:rPr>
+          <w:rFonts w:ascii="Arial" w:hAnsi="Arial" w:cs="Arial"/>
+          <w:sz w:val="28"/>
+          <w:szCs w:val="28"/>
+        </w:rPr>
+        <w:t>tendria</w:t>
+      </w:r>
+      <w:proofErr w:type="spellEnd"/>
+      <w:r>
+        <w:rPr>
+          <w:rFonts w:ascii="Arial" w:hAnsi="Arial" w:cs="Arial"/>
+          <w:sz w:val="28"/>
+          <w:szCs w:val="28"/>
+        </w:rPr>
+        <w:t xml:space="preserve"> que probar cada cambio manualmente. Esto hace que el proceso sea muy lento y propenso a regresiones silenciosas donde una funcionalidad vieja deja de operar sin que nadie se </w:t>
+      </w:r>
+      <w:proofErr w:type="spellStart"/>
+      <w:r>
+        <w:rPr>
+          <w:rFonts w:ascii="Arial" w:hAnsi="Arial" w:cs="Arial"/>
+          <w:sz w:val="28"/>
+          <w:szCs w:val="28"/>
+        </w:rPr>
+        <w:t>de</w:t>
+      </w:r>
+      <w:proofErr w:type="spellEnd"/>
+      <w:r>
+        <w:rPr>
+          <w:rFonts w:ascii="Arial" w:hAnsi="Arial" w:cs="Arial"/>
+          <w:sz w:val="28"/>
+          <w:szCs w:val="28"/>
+        </w:rPr>
+        <w:t xml:space="preserve"> cuenta hasta que revienta en </w:t>
+      </w:r>
+      <w:proofErr w:type="spellStart"/>
+      <w:r>
+        <w:rPr>
+          <w:rFonts w:ascii="Arial" w:hAnsi="Arial" w:cs="Arial"/>
+          <w:sz w:val="28"/>
+          <w:szCs w:val="28"/>
+        </w:rPr>
+        <w:t>produccion</w:t>
+      </w:r>
+      <w:proofErr w:type="spellEnd"/>
+      <w:r>
+        <w:rPr>
+          <w:rFonts w:ascii="Arial" w:hAnsi="Arial" w:cs="Arial"/>
+          <w:sz w:val="28"/>
+          <w:szCs w:val="28"/>
+        </w:rPr>
+        <w:t>.</w:t>
+      </w:r>
+    </w:p>
+    <w:p>
+      <w:pPr>
+        <w:spacing w:line="360" w:lineRule="auto"/>
+        <w:jc w:val="both"/>
+        <w:rPr>
+          <w:rFonts w:ascii="Arial" w:hAnsi="Arial" w:cs="Arial"/>
+          <w:sz w:val="28"/>
+          <w:szCs w:val="28"/>
+        </w:rPr>
+      </w:pPr>
+    </w:p>
+    <w:p>
+      <w:pPr>
+        <w:spacing w:line="360" w:lineRule="auto"/>
+        <w:jc w:val="both"/>
+        <w:rPr>
+          <w:rFonts w:ascii="Arial" w:hAnsi="Arial" w:cs="Arial"/>
+          <w:sz w:val="28"/>
+          <w:szCs w:val="28"/>
+        </w:rPr>
+      </w:pPr>
+    </w:p>
+    <w:p>
+      <w:pPr>
+        <w:spacing w:line="360" w:lineRule="auto"/>
+        <w:jc w:val="both"/>
+        <w:rPr>
+          <w:rFonts w:ascii="Arial" w:hAnsi="Arial" w:cs="Arial"/>
+          <w:sz w:val="28"/>
+          <w:szCs w:val="28"/>
+        </w:rPr>
+      </w:pPr>
+    </w:p>
+    <w:p>
+      <w:pPr>
+        <w:spacing w:line="360" w:lineRule="auto"/>
+        <w:jc w:val="both"/>
+        <w:rPr>
+          <w:rFonts w:ascii="Arial" w:hAnsi="Arial" w:cs="Arial"/>
+          <w:sz w:val="28"/>
+          <w:szCs w:val="28"/>
+        </w:rPr>
+      </w:pPr>
+    </w:p>
+    <w:p>
+      <w:pPr>
+        <w:spacing w:line="360" w:lineRule="auto"/>
+        <w:jc w:val="both"/>
+        <w:rPr>
+          <w:rFonts w:ascii="Arial" w:hAnsi="Arial" w:cs="Arial"/>
+          <w:sz w:val="28"/>
+          <w:szCs w:val="28"/>
+        </w:rPr>
+      </w:pPr>
+    </w:p>
+    <w:p>
+      <w:pPr>
+        <w:spacing w:line="360" w:lineRule="auto"/>
+        <w:jc w:val="both"/>
+        <w:rPr>
+          <w:rFonts w:ascii="Arial" w:hAnsi="Arial" w:cs="Arial"/>
+          <w:sz w:val="28"/>
+          <w:szCs w:val="28"/>
+        </w:rPr>
+      </w:pPr>
+    </w:p>
+    <w:p>
+      <w:pPr>
+        <w:spacing w:line="360" w:lineRule="auto"/>
+        <w:jc w:val="both"/>
+        <w:rPr>
+          <w:rFonts w:ascii="Arial" w:hAnsi="Arial" w:cs="Arial"/>
+          <w:sz w:val="28"/>
+          <w:szCs w:val="28"/>
+        </w:rPr>
+      </w:pPr>
+    </w:p>
+    <w:p>
+      <w:pPr>
+        <w:spacing w:line="360" w:lineRule="auto"/>
+        <w:jc w:val="both"/>
+        <w:rPr>
+          <w:rFonts w:ascii="Arial" w:hAnsi="Arial" w:cs="Arial"/>
+          <w:sz w:val="28"/>
+          <w:szCs w:val="28"/>
+        </w:rPr>
+      </w:pPr>
+    </w:p>
+    <w:p>
+      <w:pPr>
+        <w:spacing w:line="360" w:lineRule="auto"/>
+        <w:jc w:val="both"/>
+        <w:rPr>
+          <w:rFonts w:ascii="Arial" w:hAnsi="Arial" w:cs="Arial"/>
+          <w:sz w:val="28"/>
+          <w:szCs w:val="28"/>
+        </w:rPr>
+      </w:pPr>
+    </w:p>
+    <w:p>
+      <w:pPr>
+        <w:spacing w:line="360" w:lineRule="auto"/>
+        <w:jc w:val="both"/>
+        <w:rPr>
+          <w:rFonts w:ascii="Arial" w:hAnsi="Arial" w:cs="Arial"/>
+          <w:sz w:val="28"/>
+          <w:szCs w:val="28"/>
+        </w:rPr>
+      </w:pPr>
     </w:p>
     <w:p>
       <w:pPr>
@@ -1998,6 +4736,119 @@
     </w:lvl>
   </w:abstractNum>
   <w:abstractNum w:abstractNumId="14" w15:restartNumberingAfterBreak="0">
+    <w:nsid w:val="6F875BCF"/>
+    <w:multiLevelType w:val="hybridMultilevel"/>
+    <w:tmpl w:val="C074D018"/>
+    <w:lvl w:ilvl="0" w:tplc="080A0001">
+      <w:start w:val="1"/>
+      <w:numFmt w:val="bullet"/>
+      <w:lvlText w:val=""/>
+      <w:lvlJc w:val="left"/>
+      <w:pPr>
+        <w:ind w:left="720" w:hanging="360"/>
+      </w:pPr>
+      <w:rPr>
+        <w:rFonts w:ascii="Symbol" w:hAnsi="Symbol" w:hint="default"/>
+      </w:rPr>
+    </w:lvl>
+    <w:lvl w:ilvl="1" w:tplc="080A0003" w:tentative="1">
+      <w:start w:val="1"/>
+      <w:numFmt w:val="bullet"/>
+      <w:lvlText w:val="o"/>
+      <w:lvlJc w:val="left"/>
+      <w:pPr>
+        <w:ind w:left="1440" w:hanging="360"/>
+      </w:pPr>
+      <w:rPr>
+        <w:rFonts w:ascii="Courier New" w:hAnsi="Courier New" w:cs="Courier New" w:hint="default"/>
+      </w:rPr>
+    </w:lvl>
+    <w:lvl w:ilvl="2" w:tplc="080A0005" w:tentative="1">
+      <w:start w:val="1"/>
+      <w:numFmt w:val="bullet"/>
+      <w:lvlText w:val=""/>
+      <w:lvlJc w:val="left"/>
+      <w:pPr>
+        <w:ind w:left="2160" w:hanging="360"/>
+      </w:pPr>
+      <w:rPr>
+        <w:rFonts w:ascii="Wingdings" w:hAnsi="Wingdings" w:hint="default"/>
+      </w:rPr>
+    </w:lvl>
+    <w:lvl w:ilvl="3" w:tplc="080A0001" w:tentative="1">
+      <w:start w:val="1"/>
+      <w:numFmt w:val="bullet"/>
+      <w:lvlText w:val=""/>
+      <w:lvlJc w:val="left"/>
+      <w:pPr>
+        <w:ind w:left="2880" w:hanging="360"/>
+      </w:pPr>
+      <w:rPr>
+        <w:rFonts w:ascii="Symbol" w:hAnsi="Symbol" w:hint="default"/>
+      </w:rPr>
+    </w:lvl>
+    <w:lvl w:ilvl="4" w:tplc="080A0003" w:tentative="1">
+      <w:start w:val="1"/>
+      <w:numFmt w:val="bullet"/>
+      <w:lvlText w:val="o"/>
+      <w:lvlJc w:val="left"/>
+      <w:pPr>
+        <w:ind w:left="3600" w:hanging="360"/>
+      </w:pPr>
+      <w:rPr>
+        <w:rFonts w:ascii="Courier New" w:hAnsi="Courier New" w:cs="Courier New" w:hint="default"/>
+      </w:rPr>
+    </w:lvl>
+    <w:lvl w:ilvl="5" w:tplc="080A0005" w:tentative="1">
+      <w:start w:val="1"/>
+      <w:numFmt w:val="bullet"/>
+      <w:lvlText w:val=""/>
+      <w:lvlJc w:val="left"/>
+      <w:pPr>
+        <w:ind w:left="4320" w:hanging="360"/>
+      </w:pPr>
+      <w:rPr>
+        <w:rFonts w:ascii="Wingdings" w:hAnsi="Wingdings" w:hint="default"/>
+      </w:rPr>
+    </w:lvl>
+    <w:lvl w:ilvl="6" w:tplc="080A0001" w:tentative="1">
+      <w:start w:val="1"/>
+      <w:numFmt w:val="bullet"/>
+      <w:lvlText w:val=""/>
+      <w:lvlJc w:val="left"/>
+      <w:pPr>
+        <w:ind w:left="5040" w:hanging="360"/>
+      </w:pPr>
+      <w:rPr>
+        <w:rFonts w:ascii="Symbol" w:hAnsi="Symbol" w:hint="default"/>
+      </w:rPr>
+    </w:lvl>
+    <w:lvl w:ilvl="7" w:tplc="080A0003" w:tentative="1">
+      <w:start w:val="1"/>
+      <w:numFmt w:val="bullet"/>
+      <w:lvlText w:val="o"/>
+      <w:lvlJc w:val="left"/>
+      <w:pPr>
+        <w:ind w:left="5760" w:hanging="360"/>
+      </w:pPr>
+      <w:rPr>
+        <w:rFonts w:ascii="Courier New" w:hAnsi="Courier New" w:cs="Courier New" w:hint="default"/>
+      </w:rPr>
+    </w:lvl>
+    <w:lvl w:ilvl="8" w:tplc="080A0005" w:tentative="1">
+      <w:start w:val="1"/>
+      <w:numFmt w:val="bullet"/>
+      <w:lvlText w:val=""/>
+      <w:lvlJc w:val="left"/>
+      <w:pPr>
+        <w:ind w:left="6480" w:hanging="360"/>
+      </w:pPr>
+      <w:rPr>
+        <w:rFonts w:ascii="Wingdings" w:hAnsi="Wingdings" w:hint="default"/>
+      </w:rPr>
+    </w:lvl>
+  </w:abstractNum>
+  <w:abstractNum w:abstractNumId="15" w15:restartNumberingAfterBreak="0">
     <w:nsid w:val="74536325"/>
     <w:multiLevelType w:val="hybridMultilevel"/>
     <w:tmpl w:val="B47C9E08"/>
@@ -2110,7 +4961,7 @@
       </w:rPr>
     </w:lvl>
   </w:abstractNum>
-  <w:abstractNum w:abstractNumId="15" w15:restartNumberingAfterBreak="0">
+  <w:abstractNum w:abstractNumId="16" w15:restartNumberingAfterBreak="0">
     <w:nsid w:val="769F78DB"/>
     <w:multiLevelType w:val="hybridMultilevel"/>
     <w:tmpl w:val="E94C8CC4"/>
@@ -2223,7 +5074,7 @@
       </w:rPr>
     </w:lvl>
   </w:abstractNum>
-  <w:abstractNum w:abstractNumId="16" w15:restartNumberingAfterBreak="0">
+  <w:abstractNum w:abstractNumId="17" w15:restartNumberingAfterBreak="0">
     <w:nsid w:val="7BD039D9"/>
     <w:multiLevelType w:val="hybridMultilevel"/>
     <w:tmpl w:val="03845118"/>
@@ -2336,7 +5187,7 @@
       </w:rPr>
     </w:lvl>
   </w:abstractNum>
-  <w:abstractNum w:abstractNumId="17" w15:restartNumberingAfterBreak="0">
+  <w:abstractNum w:abstractNumId="18" w15:restartNumberingAfterBreak="0">
     <w:nsid w:val="7E63695A"/>
     <w:multiLevelType w:val="hybridMultilevel"/>
     <w:tmpl w:val="D4007F40"/>
@@ -2468,7 +5319,7 @@
     <w:abstractNumId w:val="11"/>
   </w:num>
   <w:num w:numId="7" w16cid:durableId="678853906">
-    <w:abstractNumId w:val="17"/>
+    <w:abstractNumId w:val="18"/>
   </w:num>
   <w:num w:numId="8" w16cid:durableId="1565605666">
     <w:abstractNumId w:val="4"/>
@@ -2477,19 +5328,19 @@
     <w:abstractNumId w:val="12"/>
   </w:num>
   <w:num w:numId="10" w16cid:durableId="523206483">
-    <w:abstractNumId w:val="15"/>
+    <w:abstractNumId w:val="16"/>
   </w:num>
   <w:num w:numId="11" w16cid:durableId="997801477">
     <w:abstractNumId w:val="1"/>
   </w:num>
   <w:num w:numId="12" w16cid:durableId="1321346736">
-    <w:abstractNumId w:val="14"/>
+    <w:abstractNumId w:val="15"/>
   </w:num>
   <w:num w:numId="13" w16cid:durableId="68119759">
     <w:abstractNumId w:val="0"/>
   </w:num>
   <w:num w:numId="14" w16cid:durableId="1429155869">
-    <w:abstractNumId w:val="16"/>
+    <w:abstractNumId w:val="17"/>
   </w:num>
   <w:num w:numId="15" w16cid:durableId="813377217">
     <w:abstractNumId w:val="10"/>
@@ -2502,6 +5353,9 @@
   </w:num>
   <w:num w:numId="18" w16cid:durableId="641621602">
     <w:abstractNumId w:val="2"/>
+  </w:num>
+  <w:num w:numId="19" w16cid:durableId="46996407">
+    <w:abstractNumId w:val="14"/>
   </w:num>
 </w:numbering>
 </file>
@@ -3109,7 +5963,6 @@
   <w:style w:type="character" w:default="1" w:styleId="Fuentedeprrafopredeter">
     <w:name w:val="Default Paragraph Font"/>
     <w:uiPriority w:val="1"/>
-    <w:semiHidden/>
     <w:unhideWhenUsed/>
   </w:style>
   <w:style w:type="table" w:default="1" w:styleId="Tablanormal">

</xml_diff>